<commit_message>
Edición de archivos finales.
</commit_message>
<xml_diff>
--- a/Files/Ha entregar/RES_COCOMO_II_ADAPTADO_RUTAS_MTC.docx
+++ b/Files/Ha entregar/RES_COCOMO_II_ADAPTADO_RUTAS_MTC.docx
@@ -4,7 +4,7 @@
   <w:body>
     <w:tbl>
       <w:tblPr>
-        <w:tblW w:w="9862" w:type="dxa"/>
+        <w:tblW w:w="9552" w:type="dxa"/>
         <w:tblBorders>
           <w:top w:val="none" w:sz="0" w:space="0" w:color="FFFFFF"/>
           <w:left w:val="none" w:sz="0" w:space="0" w:color="FFFFFF"/>
@@ -23,16 +23,16 @@
         <w:tblLook w:val="04A0" w:firstRow="1" w:lastRow="0" w:firstColumn="1" w:lastColumn="0" w:noHBand="0" w:noVBand="1"/>
       </w:tblPr>
       <w:tblGrid>
-        <w:gridCol w:w="9862"/>
+        <w:gridCol w:w="9552"/>
       </w:tblGrid>
       <w:tr>
         <w:trPr>
           <w:cantSplit/>
-          <w:trHeight w:val="3782"/>
+          <w:trHeight w:val="4325"/>
         </w:trPr>
         <w:tc>
           <w:tcPr>
-            <w:tcW w:w="9862" w:type="dxa"/>
+            <w:tcW w:w="9552" w:type="dxa"/>
             <w:shd w:val="clear" w:color="auto" w:fill="111317"/>
             <w:vAlign w:val="center"/>
           </w:tcPr>
@@ -90,6 +90,12 @@
             <w:pPr>
               <w:spacing w:before="280"/>
             </w:pPr>
+            <w:r>
+              <w:rPr>
+                <w:color w:val="8E949E"/>
+                <w:sz w:val="18"/>
+              </w:rPr>
+            </w:r>
           </w:p>
         </w:tc>
       </w:tr>
@@ -116,8 +122,8 @@
         <w:tblLook w:val="04A0" w:firstRow="1" w:lastRow="0" w:firstColumn="1" w:lastColumn="0" w:noHBand="0" w:noVBand="1"/>
       </w:tblPr>
       <w:tblGrid>
-        <w:gridCol w:w="2608"/>
-        <w:gridCol w:w="6464"/>
+        <w:gridCol w:w="2607"/>
+        <w:gridCol w:w="6462"/>
       </w:tblGrid>
       <w:tr>
         <w:tc>
@@ -397,8 +403,8 @@
         <w:tblLook w:val="04A0" w:firstRow="1" w:lastRow="0" w:firstColumn="1" w:lastColumn="0" w:noHBand="0" w:noVBand="1"/>
       </w:tblPr>
       <w:tblGrid>
-        <w:gridCol w:w="3402"/>
-        <w:gridCol w:w="5670"/>
+        <w:gridCol w:w="3401"/>
+        <w:gridCol w:w="5669"/>
       </w:tblGrid>
       <w:tr>
         <w:trPr>
@@ -1061,10 +1067,10 @@
         <w:tblLook w:val="04A0" w:firstRow="1" w:lastRow="0" w:firstColumn="1" w:lastColumn="0" w:noHBand="0" w:noVBand="1"/>
       </w:tblPr>
       <w:tblGrid>
-        <w:gridCol w:w="2268"/>
-        <w:gridCol w:w="2268"/>
-        <w:gridCol w:w="2268"/>
-        <w:gridCol w:w="2268"/>
+        <w:gridCol w:w="2267"/>
+        <w:gridCol w:w="2267"/>
+        <w:gridCol w:w="2267"/>
+        <w:gridCol w:w="2267"/>
       </w:tblGrid>
       <w:tr>
         <w:trPr>
@@ -1231,6 +1237,33 @@
           </w:p>
         </w:tc>
       </w:tr>
+    </w:tbl>
+    <w:tbl>
+      <w:tblPr>
+        <w:tblW w:w="9072" w:type="dxa"/>
+        <w:tblBorders>
+          <w:top w:val="single" w:sz="8" w:space="0" w:color="111317"/>
+          <w:left w:val="none" w:sz="0" w:space="0" w:color="FFFFFF"/>
+          <w:bottom w:val="single" w:sz="6" w:space="0" w:color="E4E6EA"/>
+          <w:right w:val="none" w:sz="0" w:space="0" w:color="FFFFFF"/>
+          <w:insideH w:val="single" w:sz="3" w:space="0" w:color="E4E6EA"/>
+          <w:insideV w:val="none" w:sz="0" w:space="0" w:color="FFFFFF"/>
+        </w:tblBorders>
+        <w:tblLayout w:type="fixed"/>
+        <w:tblCellMar>
+          <w:top w:w="95" w:type="dxa"/>
+          <w:left w:w="0" w:type="dxa"/>
+          <w:bottom w:w="95" w:type="dxa"/>
+          <w:right w:w="150" w:type="dxa"/>
+        </w:tblCellMar>
+        <w:tblLook w:val="04A0" w:firstRow="1" w:lastRow="0" w:firstColumn="1" w:lastColumn="0" w:noHBand="0" w:noVBand="1"/>
+      </w:tblPr>
+      <w:tblGrid>
+        <w:gridCol w:w="2267"/>
+        <w:gridCol w:w="2267"/>
+        <w:gridCol w:w="2267"/>
+        <w:gridCol w:w="2267"/>
+      </w:tblGrid>
       <w:tr>
         <w:trPr>
           <w:trHeight w:val="408"/>
@@ -1340,7 +1373,7 @@
                 <w:color w:val="E30613"/>
                 <w:sz w:val="17"/>
               </w:rPr>
-              <w:t>1,095</w:t>
+              <w:t>1,105</w:t>
             </w:r>
           </w:p>
         </w:tc>
@@ -1374,7 +1407,7 @@
               <w:rPr>
                 <w:sz w:val="17"/>
               </w:rPr>
-              <w:t>S/ 20 727,81</w:t>
+              <w:t>S/ 20 703,90</w:t>
             </w:r>
           </w:p>
         </w:tc>
@@ -1391,7 +1424,7 @@
               <w:rPr>
                 <w:sz w:val="17"/>
               </w:rPr>
-              <w:t>S/ 12 799,42</w:t>
+              <w:t>S/ 12 784,66</w:t>
             </w:r>
           </w:p>
         </w:tc>
@@ -1444,7 +1477,6 @@
                 <w:color w:val="E30613"/>
                 <w:sz w:val="68"/>
               </w:rPr>
-              <w:lastRenderedPageBreak/>
               <w:t>01</w:t>
             </w:r>
           </w:p>
@@ -1518,8 +1550,8 @@
         <w:tblLook w:val="04A0" w:firstRow="1" w:lastRow="0" w:firstColumn="1" w:lastColumn="0" w:noHBand="0" w:noVBand="1"/>
       </w:tblPr>
       <w:tblGrid>
-        <w:gridCol w:w="2608"/>
-        <w:gridCol w:w="6464"/>
+        <w:gridCol w:w="2607"/>
+        <w:gridCol w:w="6462"/>
       </w:tblGrid>
       <w:tr>
         <w:trPr>
@@ -1874,7 +1906,7 @@
               <w:rPr>
                 <w:sz w:val="17"/>
               </w:rPr>
-              <w:t>7 de septiembre de 2026</w:t>
+              <w:t>Septiembre de 2026</w:t>
             </w:r>
           </w:p>
         </w:tc>
@@ -1927,7 +1959,6 @@
                 <w:color w:val="E30613"/>
                 <w:sz w:val="68"/>
               </w:rPr>
-              <w:lastRenderedPageBreak/>
               <w:t>02</w:t>
             </w:r>
           </w:p>
@@ -2046,9 +2077,9 @@
         <w:tblLook w:val="04A0" w:firstRow="1" w:lastRow="0" w:firstColumn="1" w:lastColumn="0" w:noHBand="0" w:noVBand="1"/>
       </w:tblPr>
       <w:tblGrid>
-        <w:gridCol w:w="3175"/>
-        <w:gridCol w:w="2608"/>
-        <w:gridCol w:w="3289"/>
+        <w:gridCol w:w="3174"/>
+        <w:gridCol w:w="2607"/>
+        <w:gridCol w:w="3288"/>
       </w:tblGrid>
       <w:tr>
         <w:trPr>
@@ -2063,6 +2094,7 @@
           <w:p>
             <w:pPr>
               <w:spacing w:line="307" w:lineRule="auto"/>
+              <w:jc w:val="left"/>
             </w:pPr>
             <w:r>
               <w:rPr>
@@ -2083,6 +2115,7 @@
           <w:p>
             <w:pPr>
               <w:spacing w:line="307" w:lineRule="auto"/>
+              <w:jc w:val="left"/>
             </w:pPr>
             <w:r>
               <w:rPr>
@@ -2103,6 +2136,7 @@
           <w:p>
             <w:pPr>
               <w:spacing w:line="307" w:lineRule="auto"/>
+              <w:jc w:val="left"/>
             </w:pPr>
             <w:r>
               <w:rPr>
@@ -2127,6 +2161,7 @@
           <w:p>
             <w:pPr>
               <w:spacing w:line="307" w:lineRule="auto"/>
+              <w:jc w:val="left"/>
             </w:pPr>
             <w:r>
               <w:rPr>
@@ -2145,6 +2180,7 @@
           <w:p>
             <w:pPr>
               <w:spacing w:line="307" w:lineRule="auto"/>
+              <w:jc w:val="left"/>
             </w:pPr>
             <w:r>
               <w:rPr>
@@ -2161,6 +2197,7 @@
           <w:p>
             <w:pPr>
               <w:spacing w:line="307" w:lineRule="auto"/>
+              <w:jc w:val="left"/>
             </w:pPr>
             <w:r>
               <w:rPr>
@@ -2182,6 +2219,7 @@
           <w:p>
             <w:pPr>
               <w:spacing w:line="307" w:lineRule="auto"/>
+              <w:jc w:val="left"/>
             </w:pPr>
             <w:r>
               <w:rPr>
@@ -2200,6 +2238,7 @@
           <w:p>
             <w:pPr>
               <w:spacing w:line="307" w:lineRule="auto"/>
+              <w:jc w:val="left"/>
             </w:pPr>
             <w:r>
               <w:rPr>
@@ -2216,6 +2255,7 @@
           <w:p>
             <w:pPr>
               <w:spacing w:line="307" w:lineRule="auto"/>
+              <w:jc w:val="left"/>
             </w:pPr>
             <w:r>
               <w:rPr>
@@ -2237,6 +2277,7 @@
           <w:p>
             <w:pPr>
               <w:spacing w:line="307" w:lineRule="auto"/>
+              <w:jc w:val="left"/>
             </w:pPr>
             <w:r>
               <w:rPr>
@@ -2255,12 +2296,13 @@
           <w:p>
             <w:pPr>
               <w:spacing w:line="307" w:lineRule="auto"/>
+              <w:jc w:val="left"/>
             </w:pPr>
             <w:r>
               <w:rPr>
                 <w:sz w:val="18"/>
               </w:rPr>
-              <w:t>1,095</w:t>
+              <w:t>1,105</w:t>
             </w:r>
           </w:p>
         </w:tc>
@@ -2271,6 +2313,7 @@
           <w:p>
             <w:pPr>
               <w:spacing w:line="307" w:lineRule="auto"/>
+              <w:jc w:val="left"/>
             </w:pPr>
             <w:r>
               <w:rPr>
@@ -2292,6 +2335,7 @@
           <w:p>
             <w:pPr>
               <w:spacing w:line="307" w:lineRule="auto"/>
+              <w:jc w:val="left"/>
             </w:pPr>
             <w:r>
               <w:rPr>
@@ -2310,6 +2354,7 @@
           <w:p>
             <w:pPr>
               <w:spacing w:line="307" w:lineRule="auto"/>
+              <w:jc w:val="left"/>
             </w:pPr>
             <w:r>
               <w:rPr>
@@ -2326,6 +2371,7 @@
           <w:p>
             <w:pPr>
               <w:spacing w:line="307" w:lineRule="auto"/>
+              <w:jc w:val="left"/>
             </w:pPr>
             <w:r>
               <w:rPr>
@@ -2384,7 +2430,6 @@
                 <w:color w:val="E30613"/>
                 <w:sz w:val="68"/>
               </w:rPr>
-              <w:lastRenderedPageBreak/>
               <w:t>03</w:t>
             </w:r>
           </w:p>
@@ -2485,9 +2530,9 @@
         <w:tblLook w:val="04A0" w:firstRow="1" w:lastRow="0" w:firstColumn="1" w:lastColumn="0" w:noHBand="0" w:noVBand="1"/>
       </w:tblPr>
       <w:tblGrid>
-        <w:gridCol w:w="1588"/>
+        <w:gridCol w:w="1587"/>
         <w:gridCol w:w="1020"/>
-        <w:gridCol w:w="6464"/>
+        <w:gridCol w:w="6462"/>
       </w:tblGrid>
       <w:tr>
         <w:trPr>
@@ -2502,6 +2547,7 @@
           <w:p>
             <w:pPr>
               <w:spacing w:line="307" w:lineRule="auto"/>
+              <w:jc w:val="left"/>
             </w:pPr>
             <w:r>
               <w:rPr>
@@ -2543,6 +2589,7 @@
           <w:p>
             <w:pPr>
               <w:spacing w:line="307" w:lineRule="auto"/>
+              <w:jc w:val="left"/>
             </w:pPr>
             <w:r>
               <w:rPr>
@@ -2567,6 +2614,7 @@
           <w:p>
             <w:pPr>
               <w:spacing w:line="307" w:lineRule="auto"/>
+              <w:jc w:val="left"/>
             </w:pPr>
             <w:r>
               <w:rPr>
@@ -2602,6 +2650,7 @@
           <w:p>
             <w:pPr>
               <w:spacing w:line="307" w:lineRule="auto"/>
+              <w:jc w:val="left"/>
             </w:pPr>
             <w:r>
               <w:rPr>
@@ -2623,6 +2672,7 @@
           <w:p>
             <w:pPr>
               <w:spacing w:line="307" w:lineRule="auto"/>
+              <w:jc w:val="left"/>
             </w:pPr>
             <w:r>
               <w:rPr>
@@ -2658,6 +2708,7 @@
           <w:p>
             <w:pPr>
               <w:spacing w:line="307" w:lineRule="auto"/>
+              <w:jc w:val="left"/>
             </w:pPr>
             <w:r>
               <w:rPr>
@@ -2679,6 +2730,7 @@
           <w:p>
             <w:pPr>
               <w:spacing w:line="307" w:lineRule="auto"/>
+              <w:jc w:val="left"/>
             </w:pPr>
             <w:r>
               <w:rPr>
@@ -2714,6 +2766,7 @@
           <w:p>
             <w:pPr>
               <w:spacing w:line="307" w:lineRule="auto"/>
+              <w:jc w:val="left"/>
             </w:pPr>
             <w:r>
               <w:rPr>
@@ -2735,6 +2788,7 @@
           <w:p>
             <w:pPr>
               <w:spacing w:line="307" w:lineRule="auto"/>
+              <w:jc w:val="left"/>
             </w:pPr>
             <w:r>
               <w:rPr>
@@ -2770,6 +2824,7 @@
           <w:p>
             <w:pPr>
               <w:spacing w:line="307" w:lineRule="auto"/>
+              <w:jc w:val="left"/>
             </w:pPr>
             <w:r>
               <w:rPr>
@@ -2830,8 +2885,8 @@
       </w:tblPr>
       <w:tblGrid>
         <w:gridCol w:w="1700"/>
-        <w:gridCol w:w="5784"/>
-        <w:gridCol w:w="1588"/>
+        <w:gridCol w:w="5782"/>
+        <w:gridCol w:w="1587"/>
       </w:tblGrid>
       <w:tr>
         <w:trPr>
@@ -2846,6 +2901,7 @@
           <w:p>
             <w:pPr>
               <w:spacing w:line="307" w:lineRule="auto"/>
+              <w:jc w:val="left"/>
             </w:pPr>
             <w:r>
               <w:rPr>
@@ -2866,6 +2922,7 @@
           <w:p>
             <w:pPr>
               <w:spacing w:line="307" w:lineRule="auto"/>
+              <w:jc w:val="left"/>
             </w:pPr>
             <w:r>
               <w:rPr>
@@ -2911,6 +2968,7 @@
           <w:p>
             <w:pPr>
               <w:spacing w:line="307" w:lineRule="auto"/>
+              <w:jc w:val="left"/>
             </w:pPr>
             <w:r>
               <w:rPr>
@@ -2929,6 +2987,7 @@
           <w:p>
             <w:pPr>
               <w:spacing w:line="307" w:lineRule="auto"/>
+              <w:jc w:val="left"/>
             </w:pPr>
             <w:r>
               <w:rPr>
@@ -2967,6 +3026,7 @@
           <w:p>
             <w:pPr>
               <w:spacing w:line="307" w:lineRule="auto"/>
+              <w:jc w:val="left"/>
             </w:pPr>
             <w:r>
               <w:rPr>
@@ -2985,6 +3045,7 @@
           <w:p>
             <w:pPr>
               <w:spacing w:line="307" w:lineRule="auto"/>
+              <w:jc w:val="left"/>
             </w:pPr>
             <w:r>
               <w:rPr>
@@ -3023,6 +3084,7 @@
           <w:p>
             <w:pPr>
               <w:spacing w:line="307" w:lineRule="auto"/>
+              <w:jc w:val="left"/>
             </w:pPr>
             <w:r>
               <w:rPr>
@@ -3041,6 +3103,7 @@
           <w:p>
             <w:pPr>
               <w:spacing w:line="307" w:lineRule="auto"/>
+              <w:jc w:val="left"/>
             </w:pPr>
             <w:r>
               <w:rPr>
@@ -3079,6 +3142,7 @@
           <w:p>
             <w:pPr>
               <w:spacing w:line="307" w:lineRule="auto"/>
+              <w:jc w:val="left"/>
             </w:pPr>
             <w:r>
               <w:rPr>
@@ -3097,6 +3161,7 @@
           <w:p>
             <w:pPr>
               <w:spacing w:line="307" w:lineRule="auto"/>
+              <w:jc w:val="left"/>
             </w:pPr>
             <w:r>
               <w:rPr>
@@ -3135,6 +3200,7 @@
           <w:p>
             <w:pPr>
               <w:spacing w:line="307" w:lineRule="auto"/>
+              <w:jc w:val="left"/>
             </w:pPr>
             <w:r>
               <w:rPr>
@@ -3153,6 +3219,7 @@
           <w:p>
             <w:pPr>
               <w:spacing w:line="307" w:lineRule="auto"/>
+              <w:jc w:val="left"/>
             </w:pPr>
             <w:r>
               <w:rPr>
@@ -3191,6 +3258,7 @@
           <w:p>
             <w:pPr>
               <w:spacing w:line="307" w:lineRule="auto"/>
+              <w:jc w:val="left"/>
             </w:pPr>
             <w:r>
               <w:rPr>
@@ -3198,7 +3266,6 @@
                 <w:color w:val="E30613"/>
                 <w:sz w:val="18"/>
               </w:rPr>
-              <w:lastRenderedPageBreak/>
               <w:t>Seguridad</w:t>
             </w:r>
           </w:p>
@@ -3210,6 +3277,7 @@
           <w:p>
             <w:pPr>
               <w:spacing w:line="307" w:lineRule="auto"/>
+              <w:jc w:val="left"/>
             </w:pPr>
             <w:r>
               <w:rPr>
@@ -3285,7 +3353,6 @@
                 <w:color w:val="E30613"/>
                 <w:sz w:val="68"/>
               </w:rPr>
-              <w:lastRenderedPageBreak/>
               <w:t>04</w:t>
             </w:r>
           </w:p>
@@ -3377,8 +3444,8 @@
         <w:tblLook w:val="04A0" w:firstRow="1" w:lastRow="0" w:firstColumn="1" w:lastColumn="0" w:noHBand="0" w:noVBand="1"/>
       </w:tblPr>
       <w:tblGrid>
-        <w:gridCol w:w="624"/>
-        <w:gridCol w:w="4707"/>
+        <w:gridCol w:w="623"/>
+        <w:gridCol w:w="4705"/>
         <w:gridCol w:w="1417"/>
         <w:gridCol w:w="1417"/>
         <w:gridCol w:w="907"/>
@@ -5465,7 +5532,6 @@
           <w:color w:val="111317"/>
           <w:sz w:val="24"/>
         </w:rPr>
-        <w:lastRenderedPageBreak/>
         <w:t>4.2 Resumen del tamaño funcional</w:t>
       </w:r>
     </w:p>
@@ -5490,10 +5556,10 @@
         <w:tblLook w:val="04A0" w:firstRow="1" w:lastRow="0" w:firstColumn="1" w:lastColumn="0" w:noHBand="0" w:noVBand="1"/>
       </w:tblPr>
       <w:tblGrid>
-        <w:gridCol w:w="3289"/>
-        <w:gridCol w:w="2041"/>
-        <w:gridCol w:w="1871"/>
-        <w:gridCol w:w="1871"/>
+        <w:gridCol w:w="3288"/>
+        <w:gridCol w:w="2040"/>
+        <w:gridCol w:w="1870"/>
+        <w:gridCol w:w="1870"/>
       </w:tblGrid>
       <w:tr>
         <w:trPr>
@@ -6011,7 +6077,6 @@
                 <w:color w:val="E30613"/>
                 <w:sz w:val="68"/>
               </w:rPr>
-              <w:lastRenderedPageBreak/>
               <w:t>05</w:t>
             </w:r>
           </w:p>
@@ -6103,10 +6168,10 @@
         <w:tblLook w:val="04A0" w:firstRow="1" w:lastRow="0" w:firstColumn="1" w:lastColumn="0" w:noHBand="0" w:noVBand="1"/>
       </w:tblPr>
       <w:tblGrid>
-        <w:gridCol w:w="1816"/>
+        <w:gridCol w:w="1814"/>
         <w:gridCol w:w="1133"/>
         <w:gridCol w:w="1133"/>
-        <w:gridCol w:w="4990"/>
+        <w:gridCol w:w="4988"/>
       </w:tblGrid>
       <w:tr>
         <w:trPr>
@@ -6121,6 +6186,7 @@
           <w:p>
             <w:pPr>
               <w:spacing w:line="307" w:lineRule="auto"/>
+              <w:jc w:val="left"/>
             </w:pPr>
             <w:r>
               <w:rPr>
@@ -6183,6 +6249,7 @@
           <w:p>
             <w:pPr>
               <w:spacing w:line="307" w:lineRule="auto"/>
+              <w:jc w:val="left"/>
             </w:pPr>
             <w:r>
               <w:rPr>
@@ -6207,6 +6274,7 @@
           <w:p>
             <w:pPr>
               <w:spacing w:line="307" w:lineRule="auto"/>
+              <w:jc w:val="left"/>
             </w:pPr>
             <w:r>
               <w:rPr>
@@ -6259,6 +6327,7 @@
           <w:p>
             <w:pPr>
               <w:spacing w:line="307" w:lineRule="auto"/>
+              <w:jc w:val="left"/>
             </w:pPr>
             <w:r>
               <w:rPr>
@@ -6280,6 +6349,7 @@
           <w:p>
             <w:pPr>
               <w:spacing w:line="307" w:lineRule="auto"/>
+              <w:jc w:val="left"/>
             </w:pPr>
             <w:r>
               <w:rPr>
@@ -6332,6 +6402,7 @@
           <w:p>
             <w:pPr>
               <w:spacing w:line="307" w:lineRule="auto"/>
+              <w:jc w:val="left"/>
             </w:pPr>
             <w:r>
               <w:rPr>
@@ -6353,6 +6424,7 @@
           <w:p>
             <w:pPr>
               <w:spacing w:line="307" w:lineRule="auto"/>
+              <w:jc w:val="left"/>
             </w:pPr>
             <w:r>
               <w:rPr>
@@ -6405,6 +6477,7 @@
           <w:p>
             <w:pPr>
               <w:spacing w:line="307" w:lineRule="auto"/>
+              <w:jc w:val="left"/>
             </w:pPr>
             <w:r>
               <w:rPr>
@@ -6426,6 +6499,7 @@
           <w:p>
             <w:pPr>
               <w:spacing w:line="307" w:lineRule="auto"/>
+              <w:jc w:val="left"/>
             </w:pPr>
             <w:r>
               <w:rPr>
@@ -6478,6 +6552,7 @@
           <w:p>
             <w:pPr>
               <w:spacing w:line="307" w:lineRule="auto"/>
+              <w:jc w:val="left"/>
             </w:pPr>
             <w:r>
               <w:rPr>
@@ -6499,6 +6574,7 @@
           <w:p>
             <w:pPr>
               <w:spacing w:line="307" w:lineRule="auto"/>
+              <w:jc w:val="left"/>
             </w:pPr>
             <w:r>
               <w:rPr>
@@ -6551,6 +6627,7 @@
           <w:p>
             <w:pPr>
               <w:spacing w:line="307" w:lineRule="auto"/>
+              <w:jc w:val="left"/>
             </w:pPr>
             <w:r>
               <w:rPr>
@@ -6572,6 +6649,7 @@
           <w:p>
             <w:pPr>
               <w:spacing w:line="307" w:lineRule="auto"/>
+              <w:jc w:val="left"/>
             </w:pPr>
             <w:r>
               <w:rPr>
@@ -6624,6 +6702,7 @@
           <w:p>
             <w:pPr>
               <w:spacing w:line="307" w:lineRule="auto"/>
+              <w:jc w:val="left"/>
             </w:pPr>
             <w:r>
               <w:rPr>
@@ -6684,9 +6763,9 @@
       </w:tblPr>
       <w:tblGrid>
         <w:gridCol w:w="2834"/>
-        <w:gridCol w:w="2382"/>
-        <w:gridCol w:w="1928"/>
-        <w:gridCol w:w="1928"/>
+        <w:gridCol w:w="2381"/>
+        <w:gridCol w:w="1927"/>
+        <w:gridCol w:w="1927"/>
       </w:tblGrid>
       <w:tr>
         <w:trPr>
@@ -7335,10 +7414,10 @@
         <w:tblLook w:val="04A0" w:firstRow="1" w:lastRow="0" w:firstColumn="1" w:lastColumn="0" w:noHBand="0" w:noVBand="1"/>
       </w:tblPr>
       <w:tblGrid>
-        <w:gridCol w:w="2042"/>
+        <w:gridCol w:w="2040"/>
         <w:gridCol w:w="1474"/>
         <w:gridCol w:w="1474"/>
-        <w:gridCol w:w="4082"/>
+        <w:gridCol w:w="4081"/>
       </w:tblGrid>
       <w:tr>
         <w:trPr>
@@ -7353,6 +7432,7 @@
           <w:p>
             <w:pPr>
               <w:spacing w:line="307" w:lineRule="auto"/>
+              <w:jc w:val="left"/>
             </w:pPr>
             <w:r>
               <w:rPr>
@@ -7415,6 +7495,7 @@
           <w:p>
             <w:pPr>
               <w:spacing w:line="307" w:lineRule="auto"/>
+              <w:jc w:val="left"/>
             </w:pPr>
             <w:r>
               <w:rPr>
@@ -7439,6 +7520,7 @@
           <w:p>
             <w:pPr>
               <w:spacing w:line="307" w:lineRule="auto"/>
+              <w:jc w:val="left"/>
             </w:pPr>
             <w:r>
               <w:rPr>
@@ -7491,6 +7573,7 @@
           <w:p>
             <w:pPr>
               <w:spacing w:line="307" w:lineRule="auto"/>
+              <w:jc w:val="left"/>
             </w:pPr>
             <w:r>
               <w:rPr>
@@ -7512,6 +7595,7 @@
           <w:p>
             <w:pPr>
               <w:spacing w:line="307" w:lineRule="auto"/>
+              <w:jc w:val="left"/>
             </w:pPr>
             <w:r>
               <w:rPr>
@@ -7564,6 +7648,7 @@
           <w:p>
             <w:pPr>
               <w:spacing w:line="307" w:lineRule="auto"/>
+              <w:jc w:val="left"/>
             </w:pPr>
             <w:r>
               <w:rPr>
@@ -7585,6 +7670,7 @@
           <w:p>
             <w:pPr>
               <w:spacing w:line="307" w:lineRule="auto"/>
+              <w:jc w:val="left"/>
             </w:pPr>
             <w:r>
               <w:rPr>
@@ -7592,7 +7678,6 @@
                 <w:color w:val="E30613"/>
                 <w:sz w:val="17"/>
               </w:rPr>
-              <w:lastRenderedPageBreak/>
               <w:t>Mediano</w:t>
             </w:r>
           </w:p>
@@ -7638,6 +7723,7 @@
           <w:p>
             <w:pPr>
               <w:spacing w:line="307" w:lineRule="auto"/>
+              <w:jc w:val="left"/>
             </w:pPr>
             <w:r>
               <w:rPr>
@@ -7659,6 +7745,7 @@
           <w:p>
             <w:pPr>
               <w:spacing w:line="307" w:lineRule="auto"/>
+              <w:jc w:val="left"/>
             </w:pPr>
             <w:r>
               <w:rPr>
@@ -7711,6 +7798,7 @@
           <w:p>
             <w:pPr>
               <w:spacing w:line="307" w:lineRule="auto"/>
+              <w:jc w:val="left"/>
             </w:pPr>
             <w:r>
               <w:rPr>
@@ -7732,6 +7820,7 @@
           <w:p>
             <w:pPr>
               <w:spacing w:line="307" w:lineRule="auto"/>
+              <w:jc w:val="left"/>
             </w:pPr>
             <w:r>
               <w:rPr>
@@ -7784,6 +7873,7 @@
           <w:p>
             <w:pPr>
               <w:spacing w:line="307" w:lineRule="auto"/>
+              <w:jc w:val="left"/>
             </w:pPr>
             <w:r>
               <w:rPr>
@@ -7851,7 +7941,6 @@
                 <w:color w:val="E30613"/>
                 <w:sz w:val="68"/>
               </w:rPr>
-              <w:lastRenderedPageBreak/>
               <w:t>06</w:t>
             </w:r>
           </w:p>
@@ -7953,8 +8042,8 @@
       </w:tblPr>
       <w:tblGrid>
         <w:gridCol w:w="1360"/>
-        <w:gridCol w:w="2041"/>
-        <w:gridCol w:w="5671"/>
+        <w:gridCol w:w="2040"/>
+        <w:gridCol w:w="5669"/>
       </w:tblGrid>
       <w:tr>
         <w:trPr>
@@ -7990,6 +8079,7 @@
           <w:p>
             <w:pPr>
               <w:spacing w:line="307" w:lineRule="auto"/>
+              <w:jc w:val="left"/>
             </w:pPr>
             <w:r>
               <w:rPr>
@@ -8010,6 +8100,7 @@
           <w:p>
             <w:pPr>
               <w:spacing w:line="307" w:lineRule="auto"/>
+              <w:jc w:val="left"/>
             </w:pPr>
             <w:r>
               <w:rPr>
@@ -8053,6 +8144,7 @@
           <w:p>
             <w:pPr>
               <w:spacing w:line="307" w:lineRule="auto"/>
+              <w:jc w:val="left"/>
             </w:pPr>
             <w:r>
               <w:rPr>
@@ -8069,6 +8161,7 @@
           <w:p>
             <w:pPr>
               <w:spacing w:line="307" w:lineRule="auto"/>
+              <w:jc w:val="left"/>
             </w:pPr>
             <w:r>
               <w:rPr>
@@ -8109,6 +8202,7 @@
           <w:p>
             <w:pPr>
               <w:spacing w:line="307" w:lineRule="auto"/>
+              <w:jc w:val="left"/>
             </w:pPr>
             <w:r>
               <w:rPr>
@@ -8125,6 +8219,7 @@
           <w:p>
             <w:pPr>
               <w:spacing w:line="307" w:lineRule="auto"/>
+              <w:jc w:val="left"/>
             </w:pPr>
             <w:r>
               <w:rPr>
@@ -8165,6 +8260,7 @@
           <w:p>
             <w:pPr>
               <w:spacing w:line="307" w:lineRule="auto"/>
+              <w:jc w:val="left"/>
             </w:pPr>
             <w:r>
               <w:rPr>
@@ -8181,6 +8277,7 @@
           <w:p>
             <w:pPr>
               <w:spacing w:line="307" w:lineRule="auto"/>
+              <w:jc w:val="left"/>
             </w:pPr>
             <w:r>
               <w:rPr>
@@ -8221,6 +8318,7 @@
           <w:p>
             <w:pPr>
               <w:spacing w:line="307" w:lineRule="auto"/>
+              <w:jc w:val="left"/>
             </w:pPr>
             <w:r>
               <w:rPr>
@@ -8237,6 +8335,7 @@
           <w:p>
             <w:pPr>
               <w:spacing w:line="307" w:lineRule="auto"/>
+              <w:jc w:val="left"/>
             </w:pPr>
             <w:r>
               <w:rPr>
@@ -8277,6 +8376,7 @@
           <w:p>
             <w:pPr>
               <w:spacing w:line="307" w:lineRule="auto"/>
+              <w:jc w:val="left"/>
             </w:pPr>
             <w:r>
               <w:rPr>
@@ -8293,6 +8393,7 @@
           <w:p>
             <w:pPr>
               <w:spacing w:line="307" w:lineRule="auto"/>
+              <w:jc w:val="left"/>
             </w:pPr>
             <w:r>
               <w:rPr>
@@ -8333,6 +8434,7 @@
           <w:p>
             <w:pPr>
               <w:spacing w:line="307" w:lineRule="auto"/>
+              <w:jc w:val="left"/>
             </w:pPr>
             <w:r>
               <w:rPr>
@@ -8349,6 +8451,7 @@
           <w:p>
             <w:pPr>
               <w:spacing w:line="307" w:lineRule="auto"/>
+              <w:jc w:val="left"/>
             </w:pPr>
             <w:r>
               <w:rPr>
@@ -8408,7 +8511,7 @@
         <w:tblLook w:val="04A0" w:firstRow="1" w:lastRow="0" w:firstColumn="1" w:lastColumn="0" w:noHBand="0" w:noVBand="1"/>
       </w:tblPr>
       <w:tblGrid>
-        <w:gridCol w:w="3857"/>
+        <w:gridCol w:w="3855"/>
         <w:gridCol w:w="1984"/>
         <w:gridCol w:w="1644"/>
         <w:gridCol w:w="1587"/>
@@ -9260,7 +9363,6 @@
                 <w:color w:val="E30613"/>
                 <w:sz w:val="17"/>
               </w:rPr>
-              <w:lastRenderedPageBreak/>
               <w:t>Personalización de Seguridad</w:t>
             </w:r>
           </w:p>
@@ -9443,7 +9545,7 @@
               <w:rPr>
                 <w:sz w:val="17"/>
               </w:rPr>
-              <w:t>1</w:t>
+              <w:t>2</w:t>
             </w:r>
           </w:p>
         </w:tc>
@@ -9460,7 +9562,7 @@
               <w:rPr>
                 <w:sz w:val="17"/>
               </w:rPr>
-              <w:t>1,0</w:t>
+              <w:t>2,0</w:t>
             </w:r>
           </w:p>
         </w:tc>
@@ -9534,7 +9636,7 @@
               <w:rPr>
                 <w:sz w:val="17"/>
               </w:rPr>
-              <w:t>1,095</w:t>
+              <w:t>1,105</w:t>
             </w:r>
           </w:p>
         </w:tc>
@@ -9596,7 +9698,6 @@
                 <w:color w:val="E30613"/>
                 <w:sz w:val="68"/>
               </w:rPr>
-              <w:lastRenderedPageBreak/>
               <w:t>07</w:t>
             </w:r>
           </w:p>
@@ -9670,9 +9771,9 @@
         <w:tblLook w:val="04A0" w:firstRow="1" w:lastRow="0" w:firstColumn="1" w:lastColumn="0" w:noHBand="0" w:noVBand="1"/>
       </w:tblPr>
       <w:tblGrid>
-        <w:gridCol w:w="2949"/>
-        <w:gridCol w:w="2608"/>
-        <w:gridCol w:w="3515"/>
+        <w:gridCol w:w="2948"/>
+        <w:gridCol w:w="2607"/>
+        <w:gridCol w:w="3514"/>
       </w:tblGrid>
       <w:tr>
         <w:trPr>
@@ -9687,6 +9788,7 @@
           <w:p>
             <w:pPr>
               <w:spacing w:line="307" w:lineRule="auto"/>
+              <w:jc w:val="left"/>
             </w:pPr>
             <w:r>
               <w:rPr>
@@ -9707,6 +9809,7 @@
           <w:p>
             <w:pPr>
               <w:spacing w:line="307" w:lineRule="auto"/>
+              <w:jc w:val="left"/>
             </w:pPr>
             <w:r>
               <w:rPr>
@@ -9727,6 +9830,7 @@
           <w:p>
             <w:pPr>
               <w:spacing w:line="307" w:lineRule="auto"/>
+              <w:jc w:val="left"/>
             </w:pPr>
             <w:r>
               <w:rPr>
@@ -9751,6 +9855,7 @@
           <w:p>
             <w:pPr>
               <w:spacing w:line="307" w:lineRule="auto"/>
+              <w:jc w:val="left"/>
             </w:pPr>
             <w:r>
               <w:rPr>
@@ -9769,6 +9874,7 @@
           <w:p>
             <w:pPr>
               <w:spacing w:line="307" w:lineRule="auto"/>
+              <w:jc w:val="left"/>
             </w:pPr>
             <w:r>
               <w:rPr>
@@ -9785,6 +9891,7 @@
           <w:p>
             <w:pPr>
               <w:spacing w:line="307" w:lineRule="auto"/>
+              <w:jc w:val="left"/>
             </w:pPr>
             <w:r>
               <w:rPr>
@@ -9806,6 +9913,7 @@
           <w:p>
             <w:pPr>
               <w:spacing w:line="307" w:lineRule="auto"/>
+              <w:jc w:val="left"/>
             </w:pPr>
             <w:r>
               <w:rPr>
@@ -9824,6 +9932,7 @@
           <w:p>
             <w:pPr>
               <w:spacing w:line="307" w:lineRule="auto"/>
+              <w:jc w:val="left"/>
             </w:pPr>
             <w:r>
               <w:rPr>
@@ -9840,6 +9949,7 @@
           <w:p>
             <w:pPr>
               <w:spacing w:line="307" w:lineRule="auto"/>
+              <w:jc w:val="left"/>
             </w:pPr>
             <w:r>
               <w:rPr>
@@ -9861,6 +9971,7 @@
           <w:p>
             <w:pPr>
               <w:spacing w:line="307" w:lineRule="auto"/>
+              <w:jc w:val="left"/>
             </w:pPr>
             <w:r>
               <w:rPr>
@@ -9879,6 +9990,7 @@
           <w:p>
             <w:pPr>
               <w:spacing w:line="307" w:lineRule="auto"/>
+              <w:jc w:val="left"/>
             </w:pPr>
             <w:r>
               <w:rPr>
@@ -9895,6 +10007,7 @@
           <w:p>
             <w:pPr>
               <w:spacing w:line="307" w:lineRule="auto"/>
+              <w:jc w:val="left"/>
             </w:pPr>
             <w:r>
               <w:rPr>
@@ -9916,6 +10029,7 @@
           <w:p>
             <w:pPr>
               <w:spacing w:line="307" w:lineRule="auto"/>
+              <w:jc w:val="left"/>
             </w:pPr>
             <w:r>
               <w:rPr>
@@ -9934,12 +10048,13 @@
           <w:p>
             <w:pPr>
               <w:spacing w:line="307" w:lineRule="auto"/>
+              <w:jc w:val="left"/>
             </w:pPr>
             <w:r>
               <w:rPr>
                 <w:sz w:val="18"/>
               </w:rPr>
-              <w:t>1,095</w:t>
+              <w:t>1,105</w:t>
             </w:r>
           </w:p>
         </w:tc>
@@ -9950,6 +10065,7 @@
           <w:p>
             <w:pPr>
               <w:spacing w:line="307" w:lineRule="auto"/>
+              <w:jc w:val="left"/>
             </w:pPr>
             <w:r>
               <w:rPr>
@@ -9971,6 +10087,7 @@
           <w:p>
             <w:pPr>
               <w:spacing w:line="307" w:lineRule="auto"/>
+              <w:jc w:val="left"/>
             </w:pPr>
             <w:r>
               <w:rPr>
@@ -9989,6 +10106,7 @@
           <w:p>
             <w:pPr>
               <w:spacing w:line="307" w:lineRule="auto"/>
+              <w:jc w:val="left"/>
             </w:pPr>
             <w:r>
               <w:rPr>
@@ -10005,6 +10123,7 @@
           <w:p>
             <w:pPr>
               <w:spacing w:line="307" w:lineRule="auto"/>
+              <w:jc w:val="left"/>
             </w:pPr>
             <w:r>
               <w:rPr>
@@ -10026,6 +10145,7 @@
           <w:p>
             <w:pPr>
               <w:spacing w:line="307" w:lineRule="auto"/>
+              <w:jc w:val="left"/>
             </w:pPr>
             <w:r>
               <w:rPr>
@@ -10044,6 +10164,7 @@
           <w:p>
             <w:pPr>
               <w:spacing w:line="307" w:lineRule="auto"/>
+              <w:jc w:val="left"/>
             </w:pPr>
             <w:r>
               <w:rPr>
@@ -10060,6 +10181,7 @@
           <w:p>
             <w:pPr>
               <w:spacing w:line="307" w:lineRule="auto"/>
+              <w:jc w:val="left"/>
             </w:pPr>
             <w:r>
               <w:rPr>
@@ -10081,6 +10203,7 @@
           <w:p>
             <w:pPr>
               <w:spacing w:line="307" w:lineRule="auto"/>
+              <w:jc w:val="left"/>
             </w:pPr>
             <w:r>
               <w:rPr>
@@ -10099,6 +10222,7 @@
           <w:p>
             <w:pPr>
               <w:spacing w:line="307" w:lineRule="auto"/>
+              <w:jc w:val="left"/>
             </w:pPr>
             <w:r>
               <w:rPr>
@@ -10115,6 +10239,7 @@
           <w:p>
             <w:pPr>
               <w:spacing w:line="307" w:lineRule="auto"/>
+              <w:jc w:val="left"/>
             </w:pPr>
             <w:r>
               <w:rPr>
@@ -10136,6 +10261,7 @@
           <w:p>
             <w:pPr>
               <w:spacing w:line="307" w:lineRule="auto"/>
+              <w:jc w:val="left"/>
             </w:pPr>
             <w:r>
               <w:rPr>
@@ -10154,12 +10280,13 @@
           <w:p>
             <w:pPr>
               <w:spacing w:line="307" w:lineRule="auto"/>
+              <w:jc w:val="left"/>
             </w:pPr>
             <w:r>
               <w:rPr>
                 <w:sz w:val="18"/>
               </w:rPr>
-              <w:t>S/ 20 727,81</w:t>
+              <w:t>S/ 20 703,90</w:t>
             </w:r>
           </w:p>
         </w:tc>
@@ -10170,6 +10297,7 @@
           <w:p>
             <w:pPr>
               <w:spacing w:line="307" w:lineRule="auto"/>
+              <w:jc w:val="left"/>
             </w:pPr>
             <w:r>
               <w:rPr>
@@ -10228,7 +10356,6 @@
                 <w:color w:val="E30613"/>
                 <w:sz w:val="68"/>
               </w:rPr>
-              <w:lastRenderedPageBreak/>
               <w:t>08</w:t>
             </w:r>
           </w:p>
@@ -10292,23 +10419,23 @@
     </w:p>
     <w:tbl>
       <w:tblPr>
-        <w:tblW w:w="0" w:type="auto"/>
+        <w:tblW w:type="auto" w:w="0"/>
+        <w:tblLook w:firstColumn="1" w:firstRow="1" w:lastColumn="0" w:lastRow="0" w:noHBand="0" w:noVBand="1" w:val="04A0"/>
         <w:tblBorders>
           <w:top w:val="single" w:sz="8" w:space="0" w:color="111317"/>
+          <w:bottom w:val="single" w:sz="6" w:space="0" w:color="E4E6EA"/>
           <w:left w:val="none" w:sz="0" w:space="0" w:color="FFFFFF"/>
-          <w:bottom w:val="single" w:sz="6" w:space="0" w:color="E4E6EA"/>
           <w:right w:val="none" w:sz="0" w:space="0" w:color="FFFFFF"/>
           <w:insideH w:val="single" w:sz="3" w:space="0" w:color="E4E6EA"/>
           <w:insideV w:val="none" w:sz="0" w:space="0" w:color="FFFFFF"/>
         </w:tblBorders>
+        <w:tblCellMar>
+          <w:left w:w="28" w:type="dxa"/>
+          <w:right w:w="28" w:type="dxa"/>
+          <w:top w:w="40" w:type="dxa"/>
+          <w:bottom w:w="40" w:type="dxa"/>
+        </w:tblCellMar>
         <w:tblLayout w:type="fixed"/>
-        <w:tblCellMar>
-          <w:top w:w="40" w:type="dxa"/>
-          <w:left w:w="28" w:type="dxa"/>
-          <w:bottom w:w="40" w:type="dxa"/>
-          <w:right w:w="28" w:type="dxa"/>
-        </w:tblCellMar>
-        <w:tblLook w:val="04A0" w:firstRow="1" w:lastRow="0" w:firstColumn="1" w:lastColumn="0" w:noHBand="0" w:noVBand="1"/>
       </w:tblPr>
       <w:tblGrid>
         <w:gridCol w:w="1247"/>
@@ -10336,11 +10463,12 @@
       <w:tr>
         <w:tc>
           <w:tcPr>
-            <w:tcW w:w="1247" w:type="dxa"/>
+            <w:tcW w:type="dxa" w:w="1247"/>
           </w:tcPr>
           <w:p>
             <w:pPr>
               <w:spacing w:before="60" w:after="60"/>
+              <w:jc w:val="left"/>
             </w:pPr>
             <w:r>
               <w:rPr>
@@ -10354,7 +10482,7 @@
         </w:tc>
         <w:tc>
           <w:tcPr>
-            <w:tcW w:w="391" w:type="dxa"/>
+            <w:tcW w:type="dxa" w:w="391"/>
           </w:tcPr>
           <w:p>
             <w:pPr>
@@ -10373,7 +10501,7 @@
         </w:tc>
         <w:tc>
           <w:tcPr>
-            <w:tcW w:w="391" w:type="dxa"/>
+            <w:tcW w:type="dxa" w:w="391"/>
           </w:tcPr>
           <w:p>
             <w:pPr>
@@ -10392,7 +10520,7 @@
         </w:tc>
         <w:tc>
           <w:tcPr>
-            <w:tcW w:w="391" w:type="dxa"/>
+            <w:tcW w:type="dxa" w:w="391"/>
           </w:tcPr>
           <w:p>
             <w:pPr>
@@ -10411,7 +10539,7 @@
         </w:tc>
         <w:tc>
           <w:tcPr>
-            <w:tcW w:w="391" w:type="dxa"/>
+            <w:tcW w:type="dxa" w:w="391"/>
           </w:tcPr>
           <w:p>
             <w:pPr>
@@ -10430,7 +10558,7 @@
         </w:tc>
         <w:tc>
           <w:tcPr>
-            <w:tcW w:w="391" w:type="dxa"/>
+            <w:tcW w:type="dxa" w:w="391"/>
           </w:tcPr>
           <w:p>
             <w:pPr>
@@ -10449,7 +10577,7 @@
         </w:tc>
         <w:tc>
           <w:tcPr>
-            <w:tcW w:w="391" w:type="dxa"/>
+            <w:tcW w:type="dxa" w:w="391"/>
           </w:tcPr>
           <w:p>
             <w:pPr>
@@ -10468,7 +10596,7 @@
         </w:tc>
         <w:tc>
           <w:tcPr>
-            <w:tcW w:w="391" w:type="dxa"/>
+            <w:tcW w:type="dxa" w:w="391"/>
           </w:tcPr>
           <w:p>
             <w:pPr>
@@ -10487,7 +10615,7 @@
         </w:tc>
         <w:tc>
           <w:tcPr>
-            <w:tcW w:w="391" w:type="dxa"/>
+            <w:tcW w:type="dxa" w:w="391"/>
           </w:tcPr>
           <w:p>
             <w:pPr>
@@ -10506,7 +10634,7 @@
         </w:tc>
         <w:tc>
           <w:tcPr>
-            <w:tcW w:w="391" w:type="dxa"/>
+            <w:tcW w:type="dxa" w:w="391"/>
           </w:tcPr>
           <w:p>
             <w:pPr>
@@ -10525,7 +10653,7 @@
         </w:tc>
         <w:tc>
           <w:tcPr>
-            <w:tcW w:w="391" w:type="dxa"/>
+            <w:tcW w:type="dxa" w:w="391"/>
           </w:tcPr>
           <w:p>
             <w:pPr>
@@ -10544,7 +10672,7 @@
         </w:tc>
         <w:tc>
           <w:tcPr>
-            <w:tcW w:w="391" w:type="dxa"/>
+            <w:tcW w:type="dxa" w:w="391"/>
           </w:tcPr>
           <w:p>
             <w:pPr>
@@ -10563,7 +10691,7 @@
         </w:tc>
         <w:tc>
           <w:tcPr>
-            <w:tcW w:w="391" w:type="dxa"/>
+            <w:tcW w:type="dxa" w:w="391"/>
           </w:tcPr>
           <w:p>
             <w:pPr>
@@ -10582,7 +10710,7 @@
         </w:tc>
         <w:tc>
           <w:tcPr>
-            <w:tcW w:w="391" w:type="dxa"/>
+            <w:tcW w:type="dxa" w:w="391"/>
           </w:tcPr>
           <w:p>
             <w:pPr>
@@ -10601,7 +10729,7 @@
         </w:tc>
         <w:tc>
           <w:tcPr>
-            <w:tcW w:w="391" w:type="dxa"/>
+            <w:tcW w:type="dxa" w:w="391"/>
           </w:tcPr>
           <w:p>
             <w:pPr>
@@ -10620,7 +10748,7 @@
         </w:tc>
         <w:tc>
           <w:tcPr>
-            <w:tcW w:w="391" w:type="dxa"/>
+            <w:tcW w:type="dxa" w:w="391"/>
           </w:tcPr>
           <w:p>
             <w:pPr>
@@ -10639,7 +10767,7 @@
         </w:tc>
         <w:tc>
           <w:tcPr>
-            <w:tcW w:w="391" w:type="dxa"/>
+            <w:tcW w:type="dxa" w:w="391"/>
           </w:tcPr>
           <w:p>
             <w:pPr>
@@ -10658,7 +10786,7 @@
         </w:tc>
         <w:tc>
           <w:tcPr>
-            <w:tcW w:w="391" w:type="dxa"/>
+            <w:tcW w:type="dxa" w:w="391"/>
           </w:tcPr>
           <w:p>
             <w:pPr>
@@ -10677,7 +10805,7 @@
         </w:tc>
         <w:tc>
           <w:tcPr>
-            <w:tcW w:w="391" w:type="dxa"/>
+            <w:tcW w:type="dxa" w:w="391"/>
           </w:tcPr>
           <w:p>
             <w:pPr>
@@ -10696,7 +10824,7 @@
         </w:tc>
         <w:tc>
           <w:tcPr>
-            <w:tcW w:w="391" w:type="dxa"/>
+            <w:tcW w:type="dxa" w:w="391"/>
           </w:tcPr>
           <w:p>
             <w:pPr>
@@ -10715,7 +10843,7 @@
         </w:tc>
         <w:tc>
           <w:tcPr>
-            <w:tcW w:w="391" w:type="dxa"/>
+            <w:tcW w:type="dxa" w:w="391"/>
           </w:tcPr>
           <w:p>
             <w:pPr>
@@ -10736,14 +10864,16 @@
       <w:tr>
         <w:tc>
           <w:tcPr>
-            <w:tcW w:w="1247" w:type="dxa"/>
+            <w:tcW w:type="dxa" w:w="1247"/>
           </w:tcPr>
           <w:p>
             <w:pPr>
               <w:spacing w:before="60" w:after="60"/>
-            </w:pPr>
-            <w:r>
-              <w:rPr>
+              <w:jc w:val="left"/>
+            </w:pPr>
+            <w:r>
+              <w:rPr>
+                <w:b w:val="0"/>
                 <w:color w:val="3C4043"/>
                 <w:sz w:val="16"/>
               </w:rPr>
@@ -10753,7 +10883,7 @@
         </w:tc>
         <w:tc>
           <w:tcPr>
-            <w:tcW w:w="391" w:type="dxa"/>
+            <w:tcW w:type="dxa" w:w="391"/>
           </w:tcPr>
           <w:p>
             <w:pPr>
@@ -10762,6 +10892,7 @@
             </w:pPr>
             <w:r>
               <w:rPr>
+                <w:b w:val="0"/>
                 <w:color w:val="3C4043"/>
                 <w:sz w:val="16"/>
               </w:rPr>
@@ -10771,62 +10902,97 @@
         </w:tc>
         <w:tc>
           <w:tcPr>
-            <w:tcW w:w="391" w:type="dxa"/>
+            <w:tcW w:type="dxa" w:w="391"/>
           </w:tcPr>
           <w:p>
             <w:pPr>
               <w:spacing w:before="60" w:after="60"/>
               <w:jc w:val="center"/>
             </w:pPr>
-          </w:p>
-        </w:tc>
-        <w:tc>
-          <w:tcPr>
-            <w:tcW w:w="391" w:type="dxa"/>
+            <w:r>
+              <w:rPr>
+                <w:b w:val="0"/>
+                <w:color w:val="3C4043"/>
+                <w:sz w:val="16"/>
+              </w:rPr>
+            </w:r>
+          </w:p>
+        </w:tc>
+        <w:tc>
+          <w:tcPr>
+            <w:tcW w:type="dxa" w:w="391"/>
           </w:tcPr>
           <w:p>
             <w:pPr>
               <w:spacing w:before="60" w:after="60"/>
               <w:jc w:val="center"/>
             </w:pPr>
-          </w:p>
-        </w:tc>
-        <w:tc>
-          <w:tcPr>
-            <w:tcW w:w="391" w:type="dxa"/>
+            <w:r>
+              <w:rPr>
+                <w:b w:val="0"/>
+                <w:color w:val="3C4043"/>
+                <w:sz w:val="16"/>
+              </w:rPr>
+            </w:r>
+          </w:p>
+        </w:tc>
+        <w:tc>
+          <w:tcPr>
+            <w:tcW w:type="dxa" w:w="391"/>
           </w:tcPr>
           <w:p>
             <w:pPr>
               <w:spacing w:before="60" w:after="60"/>
               <w:jc w:val="center"/>
             </w:pPr>
-          </w:p>
-        </w:tc>
-        <w:tc>
-          <w:tcPr>
-            <w:tcW w:w="391" w:type="dxa"/>
+            <w:r>
+              <w:rPr>
+                <w:b w:val="0"/>
+                <w:color w:val="3C4043"/>
+                <w:sz w:val="16"/>
+              </w:rPr>
+            </w:r>
+          </w:p>
+        </w:tc>
+        <w:tc>
+          <w:tcPr>
+            <w:tcW w:type="dxa" w:w="391"/>
           </w:tcPr>
           <w:p>
             <w:pPr>
               <w:spacing w:before="60" w:after="60"/>
               <w:jc w:val="center"/>
             </w:pPr>
-          </w:p>
-        </w:tc>
-        <w:tc>
-          <w:tcPr>
-            <w:tcW w:w="391" w:type="dxa"/>
+            <w:r>
+              <w:rPr>
+                <w:b w:val="0"/>
+                <w:color w:val="3C4043"/>
+                <w:sz w:val="16"/>
+              </w:rPr>
+            </w:r>
+          </w:p>
+        </w:tc>
+        <w:tc>
+          <w:tcPr>
+            <w:tcW w:type="dxa" w:w="391"/>
           </w:tcPr>
           <w:p>
             <w:pPr>
               <w:spacing w:before="60" w:after="60"/>
               <w:jc w:val="center"/>
             </w:pPr>
-          </w:p>
-        </w:tc>
-        <w:tc>
-          <w:tcPr>
-            <w:tcW w:w="391" w:type="dxa"/>
+            <w:r>
+              <w:rPr>
+                <w:b w:val="0"/>
+                <w:color w:val="3C4043"/>
+                <w:sz w:val="16"/>
+              </w:rPr>
+            </w:r>
+          </w:p>
+        </w:tc>
+        <w:tc>
+          <w:tcPr>
+            <w:tcW w:type="dxa" w:w="391"/>
           </w:tcPr>
           <w:p>
             <w:pPr>
@@ -10835,6 +11001,7 @@
             </w:pPr>
             <w:r>
               <w:rPr>
+                <w:b w:val="0"/>
                 <w:color w:val="3C4043"/>
                 <w:sz w:val="16"/>
               </w:rPr>
@@ -10844,62 +11011,97 @@
         </w:tc>
         <w:tc>
           <w:tcPr>
-            <w:tcW w:w="391" w:type="dxa"/>
+            <w:tcW w:type="dxa" w:w="391"/>
           </w:tcPr>
           <w:p>
             <w:pPr>
               <w:spacing w:before="60" w:after="60"/>
               <w:jc w:val="center"/>
             </w:pPr>
-          </w:p>
-        </w:tc>
-        <w:tc>
-          <w:tcPr>
-            <w:tcW w:w="391" w:type="dxa"/>
+            <w:r>
+              <w:rPr>
+                <w:b w:val="0"/>
+                <w:color w:val="3C4043"/>
+                <w:sz w:val="16"/>
+              </w:rPr>
+            </w:r>
+          </w:p>
+        </w:tc>
+        <w:tc>
+          <w:tcPr>
+            <w:tcW w:type="dxa" w:w="391"/>
           </w:tcPr>
           <w:p>
             <w:pPr>
               <w:spacing w:before="60" w:after="60"/>
               <w:jc w:val="center"/>
             </w:pPr>
-          </w:p>
-        </w:tc>
-        <w:tc>
-          <w:tcPr>
-            <w:tcW w:w="391" w:type="dxa"/>
+            <w:r>
+              <w:rPr>
+                <w:b w:val="0"/>
+                <w:color w:val="3C4043"/>
+                <w:sz w:val="16"/>
+              </w:rPr>
+            </w:r>
+          </w:p>
+        </w:tc>
+        <w:tc>
+          <w:tcPr>
+            <w:tcW w:type="dxa" w:w="391"/>
           </w:tcPr>
           <w:p>
             <w:pPr>
               <w:spacing w:before="60" w:after="60"/>
               <w:jc w:val="center"/>
             </w:pPr>
-          </w:p>
-        </w:tc>
-        <w:tc>
-          <w:tcPr>
-            <w:tcW w:w="391" w:type="dxa"/>
+            <w:r>
+              <w:rPr>
+                <w:b w:val="0"/>
+                <w:color w:val="3C4043"/>
+                <w:sz w:val="16"/>
+              </w:rPr>
+            </w:r>
+          </w:p>
+        </w:tc>
+        <w:tc>
+          <w:tcPr>
+            <w:tcW w:type="dxa" w:w="391"/>
           </w:tcPr>
           <w:p>
             <w:pPr>
               <w:spacing w:before="60" w:after="60"/>
               <w:jc w:val="center"/>
             </w:pPr>
-          </w:p>
-        </w:tc>
-        <w:tc>
-          <w:tcPr>
-            <w:tcW w:w="391" w:type="dxa"/>
+            <w:r>
+              <w:rPr>
+                <w:b w:val="0"/>
+                <w:color w:val="3C4043"/>
+                <w:sz w:val="16"/>
+              </w:rPr>
+            </w:r>
+          </w:p>
+        </w:tc>
+        <w:tc>
+          <w:tcPr>
+            <w:tcW w:type="dxa" w:w="391"/>
           </w:tcPr>
           <w:p>
             <w:pPr>
               <w:spacing w:before="60" w:after="60"/>
               <w:jc w:val="center"/>
             </w:pPr>
-          </w:p>
-        </w:tc>
-        <w:tc>
-          <w:tcPr>
-            <w:tcW w:w="391" w:type="dxa"/>
+            <w:r>
+              <w:rPr>
+                <w:b w:val="0"/>
+                <w:color w:val="3C4043"/>
+                <w:sz w:val="16"/>
+              </w:rPr>
+            </w:r>
+          </w:p>
+        </w:tc>
+        <w:tc>
+          <w:tcPr>
+            <w:tcW w:type="dxa" w:w="391"/>
           </w:tcPr>
           <w:p>
             <w:pPr>
@@ -10908,6 +11110,7 @@
             </w:pPr>
             <w:r>
               <w:rPr>
+                <w:b w:val="0"/>
                 <w:color w:val="3C4043"/>
                 <w:sz w:val="16"/>
               </w:rPr>
@@ -10917,18 +11120,25 @@
         </w:tc>
         <w:tc>
           <w:tcPr>
-            <w:tcW w:w="391" w:type="dxa"/>
+            <w:tcW w:type="dxa" w:w="391"/>
           </w:tcPr>
           <w:p>
             <w:pPr>
               <w:spacing w:before="60" w:after="60"/>
               <w:jc w:val="center"/>
             </w:pPr>
-          </w:p>
-        </w:tc>
-        <w:tc>
-          <w:tcPr>
-            <w:tcW w:w="391" w:type="dxa"/>
+            <w:r>
+              <w:rPr>
+                <w:b w:val="0"/>
+                <w:color w:val="3C4043"/>
+                <w:sz w:val="16"/>
+              </w:rPr>
+            </w:r>
+          </w:p>
+        </w:tc>
+        <w:tc>
+          <w:tcPr>
+            <w:tcW w:type="dxa" w:w="391"/>
           </w:tcPr>
           <w:p>
             <w:pPr>
@@ -10937,6 +11147,7 @@
             </w:pPr>
             <w:r>
               <w:rPr>
+                <w:b w:val="0"/>
                 <w:color w:val="3C4043"/>
                 <w:sz w:val="16"/>
               </w:rPr>
@@ -10946,71 +11157,108 @@
         </w:tc>
         <w:tc>
           <w:tcPr>
-            <w:tcW w:w="391" w:type="dxa"/>
+            <w:tcW w:type="dxa" w:w="391"/>
           </w:tcPr>
           <w:p>
             <w:pPr>
               <w:spacing w:before="60" w:after="60"/>
               <w:jc w:val="center"/>
             </w:pPr>
-          </w:p>
-        </w:tc>
-        <w:tc>
-          <w:tcPr>
-            <w:tcW w:w="391" w:type="dxa"/>
+            <w:r>
+              <w:rPr>
+                <w:b w:val="0"/>
+                <w:color w:val="3C4043"/>
+                <w:sz w:val="16"/>
+              </w:rPr>
+            </w:r>
+          </w:p>
+        </w:tc>
+        <w:tc>
+          <w:tcPr>
+            <w:tcW w:type="dxa" w:w="391"/>
           </w:tcPr>
           <w:p>
             <w:pPr>
               <w:spacing w:before="60" w:after="60"/>
               <w:jc w:val="center"/>
             </w:pPr>
-          </w:p>
-        </w:tc>
-        <w:tc>
-          <w:tcPr>
-            <w:tcW w:w="391" w:type="dxa"/>
+            <w:r>
+              <w:rPr>
+                <w:b w:val="0"/>
+                <w:color w:val="3C4043"/>
+                <w:sz w:val="16"/>
+              </w:rPr>
+            </w:r>
+          </w:p>
+        </w:tc>
+        <w:tc>
+          <w:tcPr>
+            <w:tcW w:type="dxa" w:w="391"/>
           </w:tcPr>
           <w:p>
             <w:pPr>
               <w:spacing w:before="60" w:after="60"/>
               <w:jc w:val="center"/>
             </w:pPr>
-          </w:p>
-        </w:tc>
-        <w:tc>
-          <w:tcPr>
-            <w:tcW w:w="391" w:type="dxa"/>
+            <w:r>
+              <w:rPr>
+                <w:b w:val="0"/>
+                <w:color w:val="3C4043"/>
+                <w:sz w:val="16"/>
+              </w:rPr>
+            </w:r>
+          </w:p>
+        </w:tc>
+        <w:tc>
+          <w:tcPr>
+            <w:tcW w:type="dxa" w:w="391"/>
           </w:tcPr>
           <w:p>
             <w:pPr>
               <w:spacing w:before="60" w:after="60"/>
               <w:jc w:val="center"/>
             </w:pPr>
-          </w:p>
-        </w:tc>
-        <w:tc>
-          <w:tcPr>
-            <w:tcW w:w="391" w:type="dxa"/>
+            <w:r>
+              <w:rPr>
+                <w:b w:val="0"/>
+                <w:color w:val="3C4043"/>
+                <w:sz w:val="16"/>
+              </w:rPr>
+            </w:r>
+          </w:p>
+        </w:tc>
+        <w:tc>
+          <w:tcPr>
+            <w:tcW w:type="dxa" w:w="391"/>
           </w:tcPr>
           <w:p>
             <w:pPr>
               <w:spacing w:before="60" w:after="60"/>
               <w:jc w:val="center"/>
             </w:pPr>
+            <w:r>
+              <w:rPr>
+                <w:b w:val="0"/>
+                <w:color w:val="3C4043"/>
+                <w:sz w:val="16"/>
+              </w:rPr>
+            </w:r>
           </w:p>
         </w:tc>
       </w:tr>
       <w:tr>
         <w:tc>
           <w:tcPr>
-            <w:tcW w:w="1247" w:type="dxa"/>
+            <w:tcW w:type="dxa" w:w="1247"/>
           </w:tcPr>
           <w:p>
             <w:pPr>
               <w:spacing w:before="60" w:after="60"/>
-            </w:pPr>
-            <w:r>
-              <w:rPr>
+              <w:jc w:val="left"/>
+            </w:pPr>
+            <w:r>
+              <w:rPr>
+                <w:b w:val="0"/>
                 <w:color w:val="3C4043"/>
                 <w:sz w:val="16"/>
               </w:rPr>
@@ -11020,7 +11268,7 @@
         </w:tc>
         <w:tc>
           <w:tcPr>
-            <w:tcW w:w="391" w:type="dxa"/>
+            <w:tcW w:type="dxa" w:w="391"/>
           </w:tcPr>
           <w:p>
             <w:pPr>
@@ -11029,6 +11277,7 @@
             </w:pPr>
             <w:r>
               <w:rPr>
+                <w:b w:val="0"/>
                 <w:color w:val="3C4043"/>
                 <w:sz w:val="16"/>
               </w:rPr>
@@ -11038,7 +11287,7 @@
         </w:tc>
         <w:tc>
           <w:tcPr>
-            <w:tcW w:w="391" w:type="dxa"/>
+            <w:tcW w:type="dxa" w:w="391"/>
           </w:tcPr>
           <w:p>
             <w:pPr>
@@ -11047,6 +11296,7 @@
             </w:pPr>
             <w:r>
               <w:rPr>
+                <w:b w:val="0"/>
                 <w:color w:val="3C4043"/>
                 <w:sz w:val="16"/>
               </w:rPr>
@@ -11056,29 +11306,43 @@
         </w:tc>
         <w:tc>
           <w:tcPr>
-            <w:tcW w:w="391" w:type="dxa"/>
+            <w:tcW w:type="dxa" w:w="391"/>
           </w:tcPr>
           <w:p>
             <w:pPr>
               <w:spacing w:before="60" w:after="60"/>
               <w:jc w:val="center"/>
             </w:pPr>
-          </w:p>
-        </w:tc>
-        <w:tc>
-          <w:tcPr>
-            <w:tcW w:w="391" w:type="dxa"/>
+            <w:r>
+              <w:rPr>
+                <w:b w:val="0"/>
+                <w:color w:val="3C4043"/>
+                <w:sz w:val="16"/>
+              </w:rPr>
+            </w:r>
+          </w:p>
+        </w:tc>
+        <w:tc>
+          <w:tcPr>
+            <w:tcW w:type="dxa" w:w="391"/>
           </w:tcPr>
           <w:p>
             <w:pPr>
               <w:spacing w:before="60" w:after="60"/>
               <w:jc w:val="center"/>
             </w:pPr>
-          </w:p>
-        </w:tc>
-        <w:tc>
-          <w:tcPr>
-            <w:tcW w:w="391" w:type="dxa"/>
+            <w:r>
+              <w:rPr>
+                <w:b w:val="0"/>
+                <w:color w:val="3C4043"/>
+                <w:sz w:val="16"/>
+              </w:rPr>
+            </w:r>
+          </w:p>
+        </w:tc>
+        <w:tc>
+          <w:tcPr>
+            <w:tcW w:type="dxa" w:w="391"/>
           </w:tcPr>
           <w:p>
             <w:pPr>
@@ -11087,6 +11351,7 @@
             </w:pPr>
             <w:r>
               <w:rPr>
+                <w:b w:val="0"/>
                 <w:color w:val="3C4043"/>
                 <w:sz w:val="16"/>
               </w:rPr>
@@ -11096,73 +11361,115 @@
         </w:tc>
         <w:tc>
           <w:tcPr>
-            <w:tcW w:w="391" w:type="dxa"/>
+            <w:tcW w:type="dxa" w:w="391"/>
           </w:tcPr>
           <w:p>
             <w:pPr>
               <w:spacing w:before="60" w:after="60"/>
               <w:jc w:val="center"/>
             </w:pPr>
-          </w:p>
-        </w:tc>
-        <w:tc>
-          <w:tcPr>
-            <w:tcW w:w="391" w:type="dxa"/>
+            <w:r>
+              <w:rPr>
+                <w:b w:val="0"/>
+                <w:color w:val="3C4043"/>
+                <w:sz w:val="16"/>
+              </w:rPr>
+            </w:r>
+          </w:p>
+        </w:tc>
+        <w:tc>
+          <w:tcPr>
+            <w:tcW w:type="dxa" w:w="391"/>
           </w:tcPr>
           <w:p>
             <w:pPr>
               <w:spacing w:before="60" w:after="60"/>
               <w:jc w:val="center"/>
             </w:pPr>
-          </w:p>
-        </w:tc>
-        <w:tc>
-          <w:tcPr>
-            <w:tcW w:w="391" w:type="dxa"/>
+            <w:r>
+              <w:rPr>
+                <w:b w:val="0"/>
+                <w:color w:val="3C4043"/>
+                <w:sz w:val="16"/>
+              </w:rPr>
+            </w:r>
+          </w:p>
+        </w:tc>
+        <w:tc>
+          <w:tcPr>
+            <w:tcW w:type="dxa" w:w="391"/>
           </w:tcPr>
           <w:p>
             <w:pPr>
               <w:spacing w:before="60" w:after="60"/>
               <w:jc w:val="center"/>
             </w:pPr>
-          </w:p>
-        </w:tc>
-        <w:tc>
-          <w:tcPr>
-            <w:tcW w:w="391" w:type="dxa"/>
+            <w:r>
+              <w:rPr>
+                <w:b w:val="0"/>
+                <w:color w:val="3C4043"/>
+                <w:sz w:val="16"/>
+              </w:rPr>
+            </w:r>
+          </w:p>
+        </w:tc>
+        <w:tc>
+          <w:tcPr>
+            <w:tcW w:type="dxa" w:w="391"/>
           </w:tcPr>
           <w:p>
             <w:pPr>
               <w:spacing w:before="60" w:after="60"/>
               <w:jc w:val="center"/>
             </w:pPr>
-          </w:p>
-        </w:tc>
-        <w:tc>
-          <w:tcPr>
-            <w:tcW w:w="391" w:type="dxa"/>
+            <w:r>
+              <w:rPr>
+                <w:b w:val="0"/>
+                <w:color w:val="3C4043"/>
+                <w:sz w:val="16"/>
+              </w:rPr>
+            </w:r>
+          </w:p>
+        </w:tc>
+        <w:tc>
+          <w:tcPr>
+            <w:tcW w:type="dxa" w:w="391"/>
           </w:tcPr>
           <w:p>
             <w:pPr>
               <w:spacing w:before="60" w:after="60"/>
               <w:jc w:val="center"/>
             </w:pPr>
-          </w:p>
-        </w:tc>
-        <w:tc>
-          <w:tcPr>
-            <w:tcW w:w="391" w:type="dxa"/>
+            <w:r>
+              <w:rPr>
+                <w:b w:val="0"/>
+                <w:color w:val="3C4043"/>
+                <w:sz w:val="16"/>
+              </w:rPr>
+            </w:r>
+          </w:p>
+        </w:tc>
+        <w:tc>
+          <w:tcPr>
+            <w:tcW w:type="dxa" w:w="391"/>
           </w:tcPr>
           <w:p>
             <w:pPr>
               <w:spacing w:before="60" w:after="60"/>
               <w:jc w:val="center"/>
             </w:pPr>
-          </w:p>
-        </w:tc>
-        <w:tc>
-          <w:tcPr>
-            <w:tcW w:w="391" w:type="dxa"/>
+            <w:r>
+              <w:rPr>
+                <w:b w:val="0"/>
+                <w:color w:val="3C4043"/>
+                <w:sz w:val="16"/>
+              </w:rPr>
+            </w:r>
+          </w:p>
+        </w:tc>
+        <w:tc>
+          <w:tcPr>
+            <w:tcW w:type="dxa" w:w="391"/>
           </w:tcPr>
           <w:p>
             <w:pPr>
@@ -11171,6 +11478,7 @@
             </w:pPr>
             <w:r>
               <w:rPr>
+                <w:b w:val="0"/>
                 <w:color w:val="3C4043"/>
                 <w:sz w:val="16"/>
               </w:rPr>
@@ -11180,29 +11488,43 @@
         </w:tc>
         <w:tc>
           <w:tcPr>
-            <w:tcW w:w="391" w:type="dxa"/>
+            <w:tcW w:type="dxa" w:w="391"/>
           </w:tcPr>
           <w:p>
             <w:pPr>
               <w:spacing w:before="60" w:after="60"/>
               <w:jc w:val="center"/>
             </w:pPr>
-          </w:p>
-        </w:tc>
-        <w:tc>
-          <w:tcPr>
-            <w:tcW w:w="391" w:type="dxa"/>
+            <w:r>
+              <w:rPr>
+                <w:b w:val="0"/>
+                <w:color w:val="3C4043"/>
+                <w:sz w:val="16"/>
+              </w:rPr>
+            </w:r>
+          </w:p>
+        </w:tc>
+        <w:tc>
+          <w:tcPr>
+            <w:tcW w:type="dxa" w:w="391"/>
           </w:tcPr>
           <w:p>
             <w:pPr>
               <w:spacing w:before="60" w:after="60"/>
               <w:jc w:val="center"/>
             </w:pPr>
-          </w:p>
-        </w:tc>
-        <w:tc>
-          <w:tcPr>
-            <w:tcW w:w="391" w:type="dxa"/>
+            <w:r>
+              <w:rPr>
+                <w:b w:val="0"/>
+                <w:color w:val="3C4043"/>
+                <w:sz w:val="16"/>
+              </w:rPr>
+            </w:r>
+          </w:p>
+        </w:tc>
+        <w:tc>
+          <w:tcPr>
+            <w:tcW w:type="dxa" w:w="391"/>
           </w:tcPr>
           <w:p>
             <w:pPr>
@@ -11211,6 +11533,7 @@
             </w:pPr>
             <w:r>
               <w:rPr>
+                <w:b w:val="0"/>
                 <w:color w:val="3C4043"/>
                 <w:sz w:val="16"/>
               </w:rPr>
@@ -11220,71 +11543,108 @@
         </w:tc>
         <w:tc>
           <w:tcPr>
-            <w:tcW w:w="391" w:type="dxa"/>
+            <w:tcW w:type="dxa" w:w="391"/>
           </w:tcPr>
           <w:p>
             <w:pPr>
               <w:spacing w:before="60" w:after="60"/>
               <w:jc w:val="center"/>
             </w:pPr>
-          </w:p>
-        </w:tc>
-        <w:tc>
-          <w:tcPr>
-            <w:tcW w:w="391" w:type="dxa"/>
+            <w:r>
+              <w:rPr>
+                <w:b w:val="0"/>
+                <w:color w:val="3C4043"/>
+                <w:sz w:val="16"/>
+              </w:rPr>
+            </w:r>
+          </w:p>
+        </w:tc>
+        <w:tc>
+          <w:tcPr>
+            <w:tcW w:type="dxa" w:w="391"/>
           </w:tcPr>
           <w:p>
             <w:pPr>
               <w:spacing w:before="60" w:after="60"/>
               <w:jc w:val="center"/>
             </w:pPr>
-          </w:p>
-        </w:tc>
-        <w:tc>
-          <w:tcPr>
-            <w:tcW w:w="391" w:type="dxa"/>
+            <w:r>
+              <w:rPr>
+                <w:b w:val="0"/>
+                <w:color w:val="3C4043"/>
+                <w:sz w:val="16"/>
+              </w:rPr>
+            </w:r>
+          </w:p>
+        </w:tc>
+        <w:tc>
+          <w:tcPr>
+            <w:tcW w:type="dxa" w:w="391"/>
           </w:tcPr>
           <w:p>
             <w:pPr>
               <w:spacing w:before="60" w:after="60"/>
               <w:jc w:val="center"/>
             </w:pPr>
-          </w:p>
-        </w:tc>
-        <w:tc>
-          <w:tcPr>
-            <w:tcW w:w="391" w:type="dxa"/>
+            <w:r>
+              <w:rPr>
+                <w:b w:val="0"/>
+                <w:color w:val="3C4043"/>
+                <w:sz w:val="16"/>
+              </w:rPr>
+            </w:r>
+          </w:p>
+        </w:tc>
+        <w:tc>
+          <w:tcPr>
+            <w:tcW w:type="dxa" w:w="391"/>
           </w:tcPr>
           <w:p>
             <w:pPr>
               <w:spacing w:before="60" w:after="60"/>
               <w:jc w:val="center"/>
             </w:pPr>
-          </w:p>
-        </w:tc>
-        <w:tc>
-          <w:tcPr>
-            <w:tcW w:w="391" w:type="dxa"/>
+            <w:r>
+              <w:rPr>
+                <w:b w:val="0"/>
+                <w:color w:val="3C4043"/>
+                <w:sz w:val="16"/>
+              </w:rPr>
+            </w:r>
+          </w:p>
+        </w:tc>
+        <w:tc>
+          <w:tcPr>
+            <w:tcW w:type="dxa" w:w="391"/>
           </w:tcPr>
           <w:p>
             <w:pPr>
               <w:spacing w:before="60" w:after="60"/>
               <w:jc w:val="center"/>
             </w:pPr>
+            <w:r>
+              <w:rPr>
+                <w:b w:val="0"/>
+                <w:color w:val="3C4043"/>
+                <w:sz w:val="16"/>
+              </w:rPr>
+            </w:r>
           </w:p>
         </w:tc>
       </w:tr>
       <w:tr>
         <w:tc>
           <w:tcPr>
-            <w:tcW w:w="1247" w:type="dxa"/>
+            <w:tcW w:type="dxa" w:w="1247"/>
           </w:tcPr>
           <w:p>
             <w:pPr>
               <w:spacing w:before="60" w:after="60"/>
-            </w:pPr>
-            <w:r>
-              <w:rPr>
+              <w:jc w:val="left"/>
+            </w:pPr>
+            <w:r>
+              <w:rPr>
+                <w:b w:val="0"/>
                 <w:color w:val="3C4043"/>
                 <w:sz w:val="16"/>
               </w:rPr>
@@ -11294,7 +11654,7 @@
         </w:tc>
         <w:tc>
           <w:tcPr>
-            <w:tcW w:w="391" w:type="dxa"/>
+            <w:tcW w:type="dxa" w:w="391"/>
           </w:tcPr>
           <w:p>
             <w:pPr>
@@ -11303,6 +11663,7 @@
             </w:pPr>
             <w:r>
               <w:rPr>
+                <w:b w:val="0"/>
                 <w:color w:val="3C4043"/>
                 <w:sz w:val="16"/>
               </w:rPr>
@@ -11312,7 +11673,7 @@
         </w:tc>
         <w:tc>
           <w:tcPr>
-            <w:tcW w:w="391" w:type="dxa"/>
+            <w:tcW w:type="dxa" w:w="391"/>
           </w:tcPr>
           <w:p>
             <w:pPr>
@@ -11321,6 +11682,7 @@
             </w:pPr>
             <w:r>
               <w:rPr>
+                <w:b w:val="0"/>
                 <w:color w:val="3C4043"/>
                 <w:sz w:val="16"/>
               </w:rPr>
@@ -11330,7 +11692,7 @@
         </w:tc>
         <w:tc>
           <w:tcPr>
-            <w:tcW w:w="391" w:type="dxa"/>
+            <w:tcW w:type="dxa" w:w="391"/>
           </w:tcPr>
           <w:p>
             <w:pPr>
@@ -11339,6 +11701,7 @@
             </w:pPr>
             <w:r>
               <w:rPr>
+                <w:b w:val="0"/>
                 <w:color w:val="3C4043"/>
                 <w:sz w:val="16"/>
               </w:rPr>
@@ -11348,7 +11711,7 @@
         </w:tc>
         <w:tc>
           <w:tcPr>
-            <w:tcW w:w="391" w:type="dxa"/>
+            <w:tcW w:type="dxa" w:w="391"/>
           </w:tcPr>
           <w:p>
             <w:pPr>
@@ -11357,6 +11720,7 @@
             </w:pPr>
             <w:r>
               <w:rPr>
+                <w:b w:val="0"/>
                 <w:color w:val="3C4043"/>
                 <w:sz w:val="16"/>
               </w:rPr>
@@ -11366,106 +11730,169 @@
         </w:tc>
         <w:tc>
           <w:tcPr>
-            <w:tcW w:w="391" w:type="dxa"/>
+            <w:tcW w:type="dxa" w:w="391"/>
           </w:tcPr>
           <w:p>
             <w:pPr>
               <w:spacing w:before="60" w:after="60"/>
               <w:jc w:val="center"/>
             </w:pPr>
-          </w:p>
-        </w:tc>
-        <w:tc>
-          <w:tcPr>
-            <w:tcW w:w="391" w:type="dxa"/>
+            <w:r>
+              <w:rPr>
+                <w:b w:val="0"/>
+                <w:color w:val="3C4043"/>
+                <w:sz w:val="16"/>
+              </w:rPr>
+            </w:r>
+          </w:p>
+        </w:tc>
+        <w:tc>
+          <w:tcPr>
+            <w:tcW w:type="dxa" w:w="391"/>
           </w:tcPr>
           <w:p>
             <w:pPr>
               <w:spacing w:before="60" w:after="60"/>
               <w:jc w:val="center"/>
             </w:pPr>
-          </w:p>
-        </w:tc>
-        <w:tc>
-          <w:tcPr>
-            <w:tcW w:w="391" w:type="dxa"/>
+            <w:r>
+              <w:rPr>
+                <w:b w:val="0"/>
+                <w:color w:val="3C4043"/>
+                <w:sz w:val="16"/>
+              </w:rPr>
+            </w:r>
+          </w:p>
+        </w:tc>
+        <w:tc>
+          <w:tcPr>
+            <w:tcW w:type="dxa" w:w="391"/>
           </w:tcPr>
           <w:p>
             <w:pPr>
               <w:spacing w:before="60" w:after="60"/>
               <w:jc w:val="center"/>
             </w:pPr>
-          </w:p>
-        </w:tc>
-        <w:tc>
-          <w:tcPr>
-            <w:tcW w:w="391" w:type="dxa"/>
+            <w:r>
+              <w:rPr>
+                <w:b w:val="0"/>
+                <w:color w:val="3C4043"/>
+                <w:sz w:val="16"/>
+              </w:rPr>
+            </w:r>
+          </w:p>
+        </w:tc>
+        <w:tc>
+          <w:tcPr>
+            <w:tcW w:type="dxa" w:w="391"/>
           </w:tcPr>
           <w:p>
             <w:pPr>
               <w:spacing w:before="60" w:after="60"/>
               <w:jc w:val="center"/>
             </w:pPr>
-          </w:p>
-        </w:tc>
-        <w:tc>
-          <w:tcPr>
-            <w:tcW w:w="391" w:type="dxa"/>
+            <w:r>
+              <w:rPr>
+                <w:b w:val="0"/>
+                <w:color w:val="3C4043"/>
+                <w:sz w:val="16"/>
+              </w:rPr>
+            </w:r>
+          </w:p>
+        </w:tc>
+        <w:tc>
+          <w:tcPr>
+            <w:tcW w:type="dxa" w:w="391"/>
           </w:tcPr>
           <w:p>
             <w:pPr>
               <w:spacing w:before="60" w:after="60"/>
               <w:jc w:val="center"/>
             </w:pPr>
-          </w:p>
-        </w:tc>
-        <w:tc>
-          <w:tcPr>
-            <w:tcW w:w="391" w:type="dxa"/>
+            <w:r>
+              <w:rPr>
+                <w:b w:val="0"/>
+                <w:color w:val="3C4043"/>
+                <w:sz w:val="16"/>
+              </w:rPr>
+            </w:r>
+          </w:p>
+        </w:tc>
+        <w:tc>
+          <w:tcPr>
+            <w:tcW w:type="dxa" w:w="391"/>
           </w:tcPr>
           <w:p>
             <w:pPr>
               <w:spacing w:before="60" w:after="60"/>
               <w:jc w:val="center"/>
             </w:pPr>
-          </w:p>
-        </w:tc>
-        <w:tc>
-          <w:tcPr>
-            <w:tcW w:w="391" w:type="dxa"/>
+            <w:r>
+              <w:rPr>
+                <w:b w:val="0"/>
+                <w:color w:val="3C4043"/>
+                <w:sz w:val="16"/>
+              </w:rPr>
+            </w:r>
+          </w:p>
+        </w:tc>
+        <w:tc>
+          <w:tcPr>
+            <w:tcW w:type="dxa" w:w="391"/>
           </w:tcPr>
           <w:p>
             <w:pPr>
               <w:spacing w:before="60" w:after="60"/>
               <w:jc w:val="center"/>
             </w:pPr>
-          </w:p>
-        </w:tc>
-        <w:tc>
-          <w:tcPr>
-            <w:tcW w:w="391" w:type="dxa"/>
+            <w:r>
+              <w:rPr>
+                <w:b w:val="0"/>
+                <w:color w:val="3C4043"/>
+                <w:sz w:val="16"/>
+              </w:rPr>
+            </w:r>
+          </w:p>
+        </w:tc>
+        <w:tc>
+          <w:tcPr>
+            <w:tcW w:type="dxa" w:w="391"/>
           </w:tcPr>
           <w:p>
             <w:pPr>
               <w:spacing w:before="60" w:after="60"/>
               <w:jc w:val="center"/>
             </w:pPr>
-          </w:p>
-        </w:tc>
-        <w:tc>
-          <w:tcPr>
-            <w:tcW w:w="391" w:type="dxa"/>
+            <w:r>
+              <w:rPr>
+                <w:b w:val="0"/>
+                <w:color w:val="3C4043"/>
+                <w:sz w:val="16"/>
+              </w:rPr>
+            </w:r>
+          </w:p>
+        </w:tc>
+        <w:tc>
+          <w:tcPr>
+            <w:tcW w:type="dxa" w:w="391"/>
           </w:tcPr>
           <w:p>
             <w:pPr>
               <w:spacing w:before="60" w:after="60"/>
               <w:jc w:val="center"/>
             </w:pPr>
-          </w:p>
-        </w:tc>
-        <w:tc>
-          <w:tcPr>
-            <w:tcW w:w="391" w:type="dxa"/>
+            <w:r>
+              <w:rPr>
+                <w:b w:val="0"/>
+                <w:color w:val="3C4043"/>
+                <w:sz w:val="16"/>
+              </w:rPr>
+            </w:r>
+          </w:p>
+        </w:tc>
+        <w:tc>
+          <w:tcPr>
+            <w:tcW w:type="dxa" w:w="391"/>
           </w:tcPr>
           <w:p>
             <w:pPr>
@@ -11474,6 +11901,7 @@
             </w:pPr>
             <w:r>
               <w:rPr>
+                <w:b w:val="0"/>
                 <w:color w:val="3C4043"/>
                 <w:sz w:val="16"/>
               </w:rPr>
@@ -11483,7 +11911,7 @@
         </w:tc>
         <w:tc>
           <w:tcPr>
-            <w:tcW w:w="391" w:type="dxa"/>
+            <w:tcW w:type="dxa" w:w="391"/>
           </w:tcPr>
           <w:p>
             <w:pPr>
@@ -11492,6 +11920,7 @@
             </w:pPr>
             <w:r>
               <w:rPr>
+                <w:b w:val="0"/>
                 <w:color w:val="3C4043"/>
                 <w:sz w:val="16"/>
               </w:rPr>
@@ -11501,71 +11930,108 @@
         </w:tc>
         <w:tc>
           <w:tcPr>
-            <w:tcW w:w="391" w:type="dxa"/>
+            <w:tcW w:type="dxa" w:w="391"/>
           </w:tcPr>
           <w:p>
             <w:pPr>
               <w:spacing w:before="60" w:after="60"/>
               <w:jc w:val="center"/>
             </w:pPr>
-          </w:p>
-        </w:tc>
-        <w:tc>
-          <w:tcPr>
-            <w:tcW w:w="391" w:type="dxa"/>
+            <w:r>
+              <w:rPr>
+                <w:b w:val="0"/>
+                <w:color w:val="3C4043"/>
+                <w:sz w:val="16"/>
+              </w:rPr>
+            </w:r>
+          </w:p>
+        </w:tc>
+        <w:tc>
+          <w:tcPr>
+            <w:tcW w:type="dxa" w:w="391"/>
           </w:tcPr>
           <w:p>
             <w:pPr>
               <w:spacing w:before="60" w:after="60"/>
               <w:jc w:val="center"/>
             </w:pPr>
-          </w:p>
-        </w:tc>
-        <w:tc>
-          <w:tcPr>
-            <w:tcW w:w="391" w:type="dxa"/>
+            <w:r>
+              <w:rPr>
+                <w:b w:val="0"/>
+                <w:color w:val="3C4043"/>
+                <w:sz w:val="16"/>
+              </w:rPr>
+            </w:r>
+          </w:p>
+        </w:tc>
+        <w:tc>
+          <w:tcPr>
+            <w:tcW w:type="dxa" w:w="391"/>
           </w:tcPr>
           <w:p>
             <w:pPr>
               <w:spacing w:before="60" w:after="60"/>
               <w:jc w:val="center"/>
             </w:pPr>
-          </w:p>
-        </w:tc>
-        <w:tc>
-          <w:tcPr>
-            <w:tcW w:w="391" w:type="dxa"/>
+            <w:r>
+              <w:rPr>
+                <w:b w:val="0"/>
+                <w:color w:val="3C4043"/>
+                <w:sz w:val="16"/>
+              </w:rPr>
+            </w:r>
+          </w:p>
+        </w:tc>
+        <w:tc>
+          <w:tcPr>
+            <w:tcW w:type="dxa" w:w="391"/>
           </w:tcPr>
           <w:p>
             <w:pPr>
               <w:spacing w:before="60" w:after="60"/>
               <w:jc w:val="center"/>
             </w:pPr>
-          </w:p>
-        </w:tc>
-        <w:tc>
-          <w:tcPr>
-            <w:tcW w:w="391" w:type="dxa"/>
+            <w:r>
+              <w:rPr>
+                <w:b w:val="0"/>
+                <w:color w:val="3C4043"/>
+                <w:sz w:val="16"/>
+              </w:rPr>
+            </w:r>
+          </w:p>
+        </w:tc>
+        <w:tc>
+          <w:tcPr>
+            <w:tcW w:type="dxa" w:w="391"/>
           </w:tcPr>
           <w:p>
             <w:pPr>
               <w:spacing w:before="60" w:after="60"/>
               <w:jc w:val="center"/>
             </w:pPr>
+            <w:r>
+              <w:rPr>
+                <w:b w:val="0"/>
+                <w:color w:val="3C4043"/>
+                <w:sz w:val="16"/>
+              </w:rPr>
+            </w:r>
           </w:p>
         </w:tc>
       </w:tr>
       <w:tr>
         <w:tc>
           <w:tcPr>
-            <w:tcW w:w="1247" w:type="dxa"/>
+            <w:tcW w:type="dxa" w:w="1247"/>
           </w:tcPr>
           <w:p>
             <w:pPr>
               <w:spacing w:before="60" w:after="60"/>
-            </w:pPr>
-            <w:r>
-              <w:rPr>
+              <w:jc w:val="left"/>
+            </w:pPr>
+            <w:r>
+              <w:rPr>
+                <w:b w:val="0"/>
                 <w:color w:val="3C4043"/>
                 <w:sz w:val="16"/>
               </w:rPr>
@@ -11575,18 +12041,25 @@
         </w:tc>
         <w:tc>
           <w:tcPr>
-            <w:tcW w:w="391" w:type="dxa"/>
+            <w:tcW w:type="dxa" w:w="391"/>
           </w:tcPr>
           <w:p>
             <w:pPr>
               <w:spacing w:before="60" w:after="60"/>
               <w:jc w:val="center"/>
             </w:pPr>
-          </w:p>
-        </w:tc>
-        <w:tc>
-          <w:tcPr>
-            <w:tcW w:w="391" w:type="dxa"/>
+            <w:r>
+              <w:rPr>
+                <w:b w:val="0"/>
+                <w:color w:val="3C4043"/>
+                <w:sz w:val="16"/>
+              </w:rPr>
+            </w:r>
+          </w:p>
+        </w:tc>
+        <w:tc>
+          <w:tcPr>
+            <w:tcW w:type="dxa" w:w="391"/>
           </w:tcPr>
           <w:p>
             <w:pPr>
@@ -11595,6 +12068,7 @@
             </w:pPr>
             <w:r>
               <w:rPr>
+                <w:b w:val="0"/>
                 <w:color w:val="3C4043"/>
                 <w:sz w:val="16"/>
               </w:rPr>
@@ -11604,7 +12078,7 @@
         </w:tc>
         <w:tc>
           <w:tcPr>
-            <w:tcW w:w="391" w:type="dxa"/>
+            <w:tcW w:type="dxa" w:w="391"/>
           </w:tcPr>
           <w:p>
             <w:pPr>
@@ -11613,6 +12087,7 @@
             </w:pPr>
             <w:r>
               <w:rPr>
+                <w:b w:val="0"/>
                 <w:color w:val="3C4043"/>
                 <w:sz w:val="16"/>
               </w:rPr>
@@ -11622,7 +12097,7 @@
         </w:tc>
         <w:tc>
           <w:tcPr>
-            <w:tcW w:w="391" w:type="dxa"/>
+            <w:tcW w:type="dxa" w:w="391"/>
           </w:tcPr>
           <w:p>
             <w:pPr>
@@ -11631,6 +12106,7 @@
             </w:pPr>
             <w:r>
               <w:rPr>
+                <w:b w:val="0"/>
                 <w:color w:val="3C4043"/>
                 <w:sz w:val="16"/>
               </w:rPr>
@@ -11640,7 +12116,7 @@
         </w:tc>
         <w:tc>
           <w:tcPr>
-            <w:tcW w:w="391" w:type="dxa"/>
+            <w:tcW w:type="dxa" w:w="391"/>
           </w:tcPr>
           <w:p>
             <w:pPr>
@@ -11649,6 +12125,7 @@
             </w:pPr>
             <w:r>
               <w:rPr>
+                <w:b w:val="0"/>
                 <w:color w:val="3C4043"/>
                 <w:sz w:val="16"/>
               </w:rPr>
@@ -11658,7 +12135,7 @@
         </w:tc>
         <w:tc>
           <w:tcPr>
-            <w:tcW w:w="391" w:type="dxa"/>
+            <w:tcW w:type="dxa" w:w="391"/>
           </w:tcPr>
           <w:p>
             <w:pPr>
@@ -11667,6 +12144,7 @@
             </w:pPr>
             <w:r>
               <w:rPr>
+                <w:b w:val="0"/>
                 <w:color w:val="3C4043"/>
                 <w:sz w:val="16"/>
               </w:rPr>
@@ -11676,7 +12154,7 @@
         </w:tc>
         <w:tc>
           <w:tcPr>
-            <w:tcW w:w="391" w:type="dxa"/>
+            <w:tcW w:type="dxa" w:w="391"/>
           </w:tcPr>
           <w:p>
             <w:pPr>
@@ -11685,6 +12163,7 @@
             </w:pPr>
             <w:r>
               <w:rPr>
+                <w:b w:val="0"/>
                 <w:color w:val="3C4043"/>
                 <w:sz w:val="16"/>
               </w:rPr>
@@ -11694,7 +12173,7 @@
         </w:tc>
         <w:tc>
           <w:tcPr>
-            <w:tcW w:w="391" w:type="dxa"/>
+            <w:tcW w:type="dxa" w:w="391"/>
           </w:tcPr>
           <w:p>
             <w:pPr>
@@ -11703,6 +12182,7 @@
             </w:pPr>
             <w:r>
               <w:rPr>
+                <w:b w:val="0"/>
                 <w:color w:val="3C4043"/>
                 <w:sz w:val="16"/>
               </w:rPr>
@@ -11712,7 +12192,7 @@
         </w:tc>
         <w:tc>
           <w:tcPr>
-            <w:tcW w:w="391" w:type="dxa"/>
+            <w:tcW w:type="dxa" w:w="391"/>
           </w:tcPr>
           <w:p>
             <w:pPr>
@@ -11721,6 +12201,7 @@
             </w:pPr>
             <w:r>
               <w:rPr>
+                <w:b w:val="0"/>
                 <w:color w:val="3C4043"/>
                 <w:sz w:val="16"/>
               </w:rPr>
@@ -11730,7 +12211,7 @@
         </w:tc>
         <w:tc>
           <w:tcPr>
-            <w:tcW w:w="391" w:type="dxa"/>
+            <w:tcW w:type="dxa" w:w="391"/>
           </w:tcPr>
           <w:p>
             <w:pPr>
@@ -11739,6 +12220,7 @@
             </w:pPr>
             <w:r>
               <w:rPr>
+                <w:b w:val="0"/>
                 <w:color w:val="3C4043"/>
                 <w:sz w:val="16"/>
               </w:rPr>
@@ -11748,7 +12230,7 @@
         </w:tc>
         <w:tc>
           <w:tcPr>
-            <w:tcW w:w="391" w:type="dxa"/>
+            <w:tcW w:type="dxa" w:w="391"/>
           </w:tcPr>
           <w:p>
             <w:pPr>
@@ -11757,6 +12239,7 @@
             </w:pPr>
             <w:r>
               <w:rPr>
+                <w:b w:val="0"/>
                 <w:color w:val="3C4043"/>
                 <w:sz w:val="16"/>
               </w:rPr>
@@ -11766,29 +12249,43 @@
         </w:tc>
         <w:tc>
           <w:tcPr>
-            <w:tcW w:w="391" w:type="dxa"/>
+            <w:tcW w:type="dxa" w:w="391"/>
           </w:tcPr>
           <w:p>
             <w:pPr>
               <w:spacing w:before="60" w:after="60"/>
               <w:jc w:val="center"/>
             </w:pPr>
-          </w:p>
-        </w:tc>
-        <w:tc>
-          <w:tcPr>
-            <w:tcW w:w="391" w:type="dxa"/>
+            <w:r>
+              <w:rPr>
+                <w:b w:val="0"/>
+                <w:color w:val="3C4043"/>
+                <w:sz w:val="16"/>
+              </w:rPr>
+            </w:r>
+          </w:p>
+        </w:tc>
+        <w:tc>
+          <w:tcPr>
+            <w:tcW w:type="dxa" w:w="391"/>
           </w:tcPr>
           <w:p>
             <w:pPr>
               <w:spacing w:before="60" w:after="60"/>
               <w:jc w:val="center"/>
             </w:pPr>
-          </w:p>
-        </w:tc>
-        <w:tc>
-          <w:tcPr>
-            <w:tcW w:w="391" w:type="dxa"/>
+            <w:r>
+              <w:rPr>
+                <w:b w:val="0"/>
+                <w:color w:val="3C4043"/>
+                <w:sz w:val="16"/>
+              </w:rPr>
+            </w:r>
+          </w:p>
+        </w:tc>
+        <w:tc>
+          <w:tcPr>
+            <w:tcW w:type="dxa" w:w="391"/>
           </w:tcPr>
           <w:p>
             <w:pPr>
@@ -11797,6 +12294,7 @@
             </w:pPr>
             <w:r>
               <w:rPr>
+                <w:b w:val="0"/>
                 <w:color w:val="3C4043"/>
                 <w:sz w:val="16"/>
               </w:rPr>
@@ -11806,82 +12304,126 @@
         </w:tc>
         <w:tc>
           <w:tcPr>
-            <w:tcW w:w="391" w:type="dxa"/>
+            <w:tcW w:type="dxa" w:w="391"/>
           </w:tcPr>
           <w:p>
             <w:pPr>
               <w:spacing w:before="60" w:after="60"/>
               <w:jc w:val="center"/>
             </w:pPr>
-          </w:p>
-        </w:tc>
-        <w:tc>
-          <w:tcPr>
-            <w:tcW w:w="391" w:type="dxa"/>
+            <w:r>
+              <w:rPr>
+                <w:b w:val="0"/>
+                <w:color w:val="3C4043"/>
+                <w:sz w:val="16"/>
+              </w:rPr>
+            </w:r>
+          </w:p>
+        </w:tc>
+        <w:tc>
+          <w:tcPr>
+            <w:tcW w:type="dxa" w:w="391"/>
           </w:tcPr>
           <w:p>
             <w:pPr>
               <w:spacing w:before="60" w:after="60"/>
               <w:jc w:val="center"/>
             </w:pPr>
-          </w:p>
-        </w:tc>
-        <w:tc>
-          <w:tcPr>
-            <w:tcW w:w="391" w:type="dxa"/>
+            <w:r>
+              <w:rPr>
+                <w:b w:val="0"/>
+                <w:color w:val="3C4043"/>
+                <w:sz w:val="16"/>
+              </w:rPr>
+            </w:r>
+          </w:p>
+        </w:tc>
+        <w:tc>
+          <w:tcPr>
+            <w:tcW w:type="dxa" w:w="391"/>
           </w:tcPr>
           <w:p>
             <w:pPr>
               <w:spacing w:before="60" w:after="60"/>
               <w:jc w:val="center"/>
             </w:pPr>
-          </w:p>
-        </w:tc>
-        <w:tc>
-          <w:tcPr>
-            <w:tcW w:w="391" w:type="dxa"/>
+            <w:r>
+              <w:rPr>
+                <w:b w:val="0"/>
+                <w:color w:val="3C4043"/>
+                <w:sz w:val="16"/>
+              </w:rPr>
+            </w:r>
+          </w:p>
+        </w:tc>
+        <w:tc>
+          <w:tcPr>
+            <w:tcW w:type="dxa" w:w="391"/>
           </w:tcPr>
           <w:p>
             <w:pPr>
               <w:spacing w:before="60" w:after="60"/>
               <w:jc w:val="center"/>
             </w:pPr>
-          </w:p>
-        </w:tc>
-        <w:tc>
-          <w:tcPr>
-            <w:tcW w:w="391" w:type="dxa"/>
+            <w:r>
+              <w:rPr>
+                <w:b w:val="0"/>
+                <w:color w:val="3C4043"/>
+                <w:sz w:val="16"/>
+              </w:rPr>
+            </w:r>
+          </w:p>
+        </w:tc>
+        <w:tc>
+          <w:tcPr>
+            <w:tcW w:type="dxa" w:w="391"/>
           </w:tcPr>
           <w:p>
             <w:pPr>
               <w:spacing w:before="60" w:after="60"/>
               <w:jc w:val="center"/>
             </w:pPr>
-          </w:p>
-        </w:tc>
-        <w:tc>
-          <w:tcPr>
-            <w:tcW w:w="391" w:type="dxa"/>
+            <w:r>
+              <w:rPr>
+                <w:b w:val="0"/>
+                <w:color w:val="3C4043"/>
+                <w:sz w:val="16"/>
+              </w:rPr>
+            </w:r>
+          </w:p>
+        </w:tc>
+        <w:tc>
+          <w:tcPr>
+            <w:tcW w:type="dxa" w:w="391"/>
           </w:tcPr>
           <w:p>
             <w:pPr>
               <w:spacing w:before="60" w:after="60"/>
               <w:jc w:val="center"/>
             </w:pPr>
+            <w:r>
+              <w:rPr>
+                <w:b w:val="0"/>
+                <w:color w:val="3C4043"/>
+                <w:sz w:val="16"/>
+              </w:rPr>
+            </w:r>
           </w:p>
         </w:tc>
       </w:tr>
       <w:tr>
         <w:tc>
           <w:tcPr>
-            <w:tcW w:w="1247" w:type="dxa"/>
+            <w:tcW w:type="dxa" w:w="1247"/>
           </w:tcPr>
           <w:p>
             <w:pPr>
               <w:spacing w:before="60" w:after="60"/>
-            </w:pPr>
-            <w:r>
-              <w:rPr>
+              <w:jc w:val="left"/>
+            </w:pPr>
+            <w:r>
+              <w:rPr>
+                <w:b w:val="0"/>
                 <w:color w:val="3C4043"/>
                 <w:sz w:val="16"/>
               </w:rPr>
@@ -11891,29 +12433,43 @@
         </w:tc>
         <w:tc>
           <w:tcPr>
-            <w:tcW w:w="391" w:type="dxa"/>
+            <w:tcW w:type="dxa" w:w="391"/>
           </w:tcPr>
           <w:p>
             <w:pPr>
               <w:spacing w:before="60" w:after="60"/>
               <w:jc w:val="center"/>
             </w:pPr>
-          </w:p>
-        </w:tc>
-        <w:tc>
-          <w:tcPr>
-            <w:tcW w:w="391" w:type="dxa"/>
+            <w:r>
+              <w:rPr>
+                <w:b w:val="0"/>
+                <w:color w:val="3C4043"/>
+                <w:sz w:val="16"/>
+              </w:rPr>
+            </w:r>
+          </w:p>
+        </w:tc>
+        <w:tc>
+          <w:tcPr>
+            <w:tcW w:type="dxa" w:w="391"/>
           </w:tcPr>
           <w:p>
             <w:pPr>
               <w:spacing w:before="60" w:after="60"/>
               <w:jc w:val="center"/>
             </w:pPr>
-          </w:p>
-        </w:tc>
-        <w:tc>
-          <w:tcPr>
-            <w:tcW w:w="391" w:type="dxa"/>
+            <w:r>
+              <w:rPr>
+                <w:b w:val="0"/>
+                <w:color w:val="3C4043"/>
+                <w:sz w:val="16"/>
+              </w:rPr>
+            </w:r>
+          </w:p>
+        </w:tc>
+        <w:tc>
+          <w:tcPr>
+            <w:tcW w:type="dxa" w:w="391"/>
           </w:tcPr>
           <w:p>
             <w:pPr>
@@ -11922,6 +12478,7 @@
             </w:pPr>
             <w:r>
               <w:rPr>
+                <w:b w:val="0"/>
                 <w:color w:val="3C4043"/>
                 <w:sz w:val="16"/>
               </w:rPr>
@@ -11931,51 +12488,79 @@
         </w:tc>
         <w:tc>
           <w:tcPr>
-            <w:tcW w:w="391" w:type="dxa"/>
+            <w:tcW w:type="dxa" w:w="391"/>
           </w:tcPr>
           <w:p>
             <w:pPr>
               <w:spacing w:before="60" w:after="60"/>
               <w:jc w:val="center"/>
             </w:pPr>
-          </w:p>
-        </w:tc>
-        <w:tc>
-          <w:tcPr>
-            <w:tcW w:w="391" w:type="dxa"/>
+            <w:r>
+              <w:rPr>
+                <w:b w:val="0"/>
+                <w:color w:val="3C4043"/>
+                <w:sz w:val="16"/>
+              </w:rPr>
+            </w:r>
+          </w:p>
+        </w:tc>
+        <w:tc>
+          <w:tcPr>
+            <w:tcW w:type="dxa" w:w="391"/>
           </w:tcPr>
           <w:p>
             <w:pPr>
               <w:spacing w:before="60" w:after="60"/>
               <w:jc w:val="center"/>
             </w:pPr>
-          </w:p>
-        </w:tc>
-        <w:tc>
-          <w:tcPr>
-            <w:tcW w:w="391" w:type="dxa"/>
+            <w:r>
+              <w:rPr>
+                <w:b w:val="0"/>
+                <w:color w:val="3C4043"/>
+                <w:sz w:val="16"/>
+              </w:rPr>
+            </w:r>
+          </w:p>
+        </w:tc>
+        <w:tc>
+          <w:tcPr>
+            <w:tcW w:type="dxa" w:w="391"/>
           </w:tcPr>
           <w:p>
             <w:pPr>
               <w:spacing w:before="60" w:after="60"/>
               <w:jc w:val="center"/>
             </w:pPr>
-          </w:p>
-        </w:tc>
-        <w:tc>
-          <w:tcPr>
-            <w:tcW w:w="391" w:type="dxa"/>
+            <w:r>
+              <w:rPr>
+                <w:b w:val="0"/>
+                <w:color w:val="3C4043"/>
+                <w:sz w:val="16"/>
+              </w:rPr>
+            </w:r>
+          </w:p>
+        </w:tc>
+        <w:tc>
+          <w:tcPr>
+            <w:tcW w:type="dxa" w:w="391"/>
           </w:tcPr>
           <w:p>
             <w:pPr>
               <w:spacing w:before="60" w:after="60"/>
               <w:jc w:val="center"/>
             </w:pPr>
-          </w:p>
-        </w:tc>
-        <w:tc>
-          <w:tcPr>
-            <w:tcW w:w="391" w:type="dxa"/>
+            <w:r>
+              <w:rPr>
+                <w:b w:val="0"/>
+                <w:color w:val="3C4043"/>
+                <w:sz w:val="16"/>
+              </w:rPr>
+            </w:r>
+          </w:p>
+        </w:tc>
+        <w:tc>
+          <w:tcPr>
+            <w:tcW w:type="dxa" w:w="391"/>
           </w:tcPr>
           <w:p>
             <w:pPr>
@@ -11984,6 +12569,7 @@
             </w:pPr>
             <w:r>
               <w:rPr>
+                <w:b w:val="0"/>
                 <w:color w:val="3C4043"/>
                 <w:sz w:val="16"/>
               </w:rPr>
@@ -11993,7 +12579,7 @@
         </w:tc>
         <w:tc>
           <w:tcPr>
-            <w:tcW w:w="391" w:type="dxa"/>
+            <w:tcW w:type="dxa" w:w="391"/>
           </w:tcPr>
           <w:p>
             <w:pPr>
@@ -12002,6 +12588,7 @@
             </w:pPr>
             <w:r>
               <w:rPr>
+                <w:b w:val="0"/>
                 <w:color w:val="3C4043"/>
                 <w:sz w:val="16"/>
               </w:rPr>
@@ -12011,18 +12598,25 @@
         </w:tc>
         <w:tc>
           <w:tcPr>
-            <w:tcW w:w="391" w:type="dxa"/>
+            <w:tcW w:type="dxa" w:w="391"/>
           </w:tcPr>
           <w:p>
             <w:pPr>
               <w:spacing w:before="60" w:after="60"/>
               <w:jc w:val="center"/>
             </w:pPr>
-          </w:p>
-        </w:tc>
-        <w:tc>
-          <w:tcPr>
-            <w:tcW w:w="391" w:type="dxa"/>
+            <w:r>
+              <w:rPr>
+                <w:b w:val="0"/>
+                <w:color w:val="3C4043"/>
+                <w:sz w:val="16"/>
+              </w:rPr>
+            </w:r>
+          </w:p>
+        </w:tc>
+        <w:tc>
+          <w:tcPr>
+            <w:tcW w:type="dxa" w:w="391"/>
           </w:tcPr>
           <w:p>
             <w:pPr>
@@ -12031,6 +12625,7 @@
             </w:pPr>
             <w:r>
               <w:rPr>
+                <w:b w:val="0"/>
                 <w:color w:val="3C4043"/>
                 <w:sz w:val="16"/>
               </w:rPr>
@@ -12040,7 +12635,7 @@
         </w:tc>
         <w:tc>
           <w:tcPr>
-            <w:tcW w:w="391" w:type="dxa"/>
+            <w:tcW w:type="dxa" w:w="391"/>
           </w:tcPr>
           <w:p>
             <w:pPr>
@@ -12049,6 +12644,7 @@
             </w:pPr>
             <w:r>
               <w:rPr>
+                <w:b w:val="0"/>
                 <w:color w:val="3C4043"/>
                 <w:sz w:val="16"/>
               </w:rPr>
@@ -12058,7 +12654,7 @@
         </w:tc>
         <w:tc>
           <w:tcPr>
-            <w:tcW w:w="391" w:type="dxa"/>
+            <w:tcW w:type="dxa" w:w="391"/>
           </w:tcPr>
           <w:p>
             <w:pPr>
@@ -12067,6 +12663,7 @@
             </w:pPr>
             <w:r>
               <w:rPr>
+                <w:b w:val="0"/>
                 <w:color w:val="3C4043"/>
                 <w:sz w:val="16"/>
               </w:rPr>
@@ -12076,7 +12673,7 @@
         </w:tc>
         <w:tc>
           <w:tcPr>
-            <w:tcW w:w="391" w:type="dxa"/>
+            <w:tcW w:type="dxa" w:w="391"/>
           </w:tcPr>
           <w:p>
             <w:pPr>
@@ -12085,6 +12682,7 @@
             </w:pPr>
             <w:r>
               <w:rPr>
+                <w:b w:val="0"/>
                 <w:color w:val="3C4043"/>
                 <w:sz w:val="16"/>
               </w:rPr>
@@ -12094,68 +12692,110 @@
         </w:tc>
         <w:tc>
           <w:tcPr>
-            <w:tcW w:w="391" w:type="dxa"/>
+            <w:tcW w:type="dxa" w:w="391"/>
           </w:tcPr>
           <w:p>
             <w:pPr>
               <w:spacing w:before="60" w:after="60"/>
               <w:jc w:val="center"/>
             </w:pPr>
-          </w:p>
-        </w:tc>
-        <w:tc>
-          <w:tcPr>
-            <w:tcW w:w="391" w:type="dxa"/>
+            <w:r>
+              <w:rPr>
+                <w:b w:val="0"/>
+                <w:color w:val="3C4043"/>
+                <w:sz w:val="16"/>
+              </w:rPr>
+            </w:r>
+          </w:p>
+        </w:tc>
+        <w:tc>
+          <w:tcPr>
+            <w:tcW w:type="dxa" w:w="391"/>
           </w:tcPr>
           <w:p>
             <w:pPr>
               <w:spacing w:before="60" w:after="60"/>
               <w:jc w:val="center"/>
             </w:pPr>
-          </w:p>
-        </w:tc>
-        <w:tc>
-          <w:tcPr>
-            <w:tcW w:w="391" w:type="dxa"/>
+            <w:r>
+              <w:rPr>
+                <w:b w:val="0"/>
+                <w:color w:val="3C4043"/>
+                <w:sz w:val="16"/>
+              </w:rPr>
+            </w:r>
+          </w:p>
+        </w:tc>
+        <w:tc>
+          <w:tcPr>
+            <w:tcW w:type="dxa" w:w="391"/>
           </w:tcPr>
           <w:p>
             <w:pPr>
               <w:spacing w:before="60" w:after="60"/>
               <w:jc w:val="center"/>
             </w:pPr>
-          </w:p>
-        </w:tc>
-        <w:tc>
-          <w:tcPr>
-            <w:tcW w:w="391" w:type="dxa"/>
+            <w:r>
+              <w:rPr>
+                <w:b w:val="0"/>
+                <w:color w:val="3C4043"/>
+                <w:sz w:val="16"/>
+              </w:rPr>
+            </w:r>
+          </w:p>
+        </w:tc>
+        <w:tc>
+          <w:tcPr>
+            <w:tcW w:type="dxa" w:w="391"/>
           </w:tcPr>
           <w:p>
             <w:pPr>
               <w:spacing w:before="60" w:after="60"/>
               <w:jc w:val="center"/>
             </w:pPr>
-          </w:p>
-        </w:tc>
-        <w:tc>
-          <w:tcPr>
-            <w:tcW w:w="391" w:type="dxa"/>
+            <w:r>
+              <w:rPr>
+                <w:b w:val="0"/>
+                <w:color w:val="3C4043"/>
+                <w:sz w:val="16"/>
+              </w:rPr>
+            </w:r>
+          </w:p>
+        </w:tc>
+        <w:tc>
+          <w:tcPr>
+            <w:tcW w:type="dxa" w:w="391"/>
           </w:tcPr>
           <w:p>
             <w:pPr>
               <w:spacing w:before="60" w:after="60"/>
               <w:jc w:val="center"/>
             </w:pPr>
-          </w:p>
-        </w:tc>
-        <w:tc>
-          <w:tcPr>
-            <w:tcW w:w="391" w:type="dxa"/>
+            <w:r>
+              <w:rPr>
+                <w:b w:val="0"/>
+                <w:color w:val="3C4043"/>
+                <w:sz w:val="16"/>
+              </w:rPr>
+            </w:r>
+          </w:p>
+        </w:tc>
+        <w:tc>
+          <w:tcPr>
+            <w:tcW w:type="dxa" w:w="391"/>
           </w:tcPr>
           <w:p>
             <w:pPr>
               <w:spacing w:before="60" w:after="60"/>
               <w:jc w:val="center"/>
             </w:pPr>
+            <w:r>
+              <w:rPr>
+                <w:b w:val="0"/>
+                <w:color w:val="3C4043"/>
+                <w:sz w:val="16"/>
+              </w:rPr>
+            </w:r>
           </w:p>
         </w:tc>
       </w:tr>
@@ -12191,8 +12831,8 @@
         <w:tblLook w:val="04A0" w:firstRow="1" w:lastRow="0" w:firstColumn="1" w:lastColumn="0" w:noHBand="0" w:noVBand="1"/>
       </w:tblPr>
       <w:tblGrid>
-        <w:gridCol w:w="1815"/>
-        <w:gridCol w:w="1815"/>
+        <w:gridCol w:w="1814"/>
+        <w:gridCol w:w="1814"/>
         <w:gridCol w:w="1814"/>
         <w:gridCol w:w="1814"/>
         <w:gridCol w:w="1814"/>
@@ -12810,7 +13450,6 @@
                 <w:color w:val="E30613"/>
                 <w:sz w:val="68"/>
               </w:rPr>
-              <w:lastRenderedPageBreak/>
               <w:t>09</w:t>
             </w:r>
           </w:p>
@@ -12885,9 +13524,9 @@
       </w:tblPr>
       <w:tblGrid>
         <w:gridCol w:w="3174"/>
-        <w:gridCol w:w="1928"/>
-        <w:gridCol w:w="1985"/>
-        <w:gridCol w:w="1985"/>
+        <w:gridCol w:w="1927"/>
+        <w:gridCol w:w="1984"/>
+        <w:gridCol w:w="1984"/>
       </w:tblGrid>
       <w:tr>
         <w:trPr>
@@ -13030,7 +13669,7 @@
               <w:rPr>
                 <w:sz w:val="17"/>
               </w:rPr>
-              <w:t>4 145,56</w:t>
+              <w:t>4 140,78</w:t>
             </w:r>
           </w:p>
         </w:tc>
@@ -13047,7 +13686,7 @@
               <w:rPr>
                 <w:sz w:val="17"/>
               </w:rPr>
-              <w:t>829,11</w:t>
+              <w:t>828,16</w:t>
             </w:r>
           </w:p>
         </w:tc>
@@ -13104,7 +13743,7 @@
               <w:rPr>
                 <w:sz w:val="17"/>
               </w:rPr>
-              <w:t>5 181,95</w:t>
+              <w:t>5 175,98</w:t>
             </w:r>
           </w:p>
         </w:tc>
@@ -13121,7 +13760,7 @@
               <w:rPr>
                 <w:sz w:val="17"/>
               </w:rPr>
-              <w:t>1 295,49</w:t>
+              <w:t>1 293,99</w:t>
             </w:r>
           </w:p>
         </w:tc>
@@ -13178,7 +13817,7 @@
               <w:rPr>
                 <w:sz w:val="17"/>
               </w:rPr>
-              <w:t>6 218,34</w:t>
+              <w:t>6 211,17</w:t>
             </w:r>
           </w:p>
         </w:tc>
@@ -13195,7 +13834,7 @@
               <w:rPr>
                 <w:sz w:val="17"/>
               </w:rPr>
-              <w:t>1 865,50</w:t>
+              <w:t>1 863,35</w:t>
             </w:r>
           </w:p>
         </w:tc>
@@ -13252,7 +13891,7 @@
               <w:rPr>
                 <w:sz w:val="17"/>
               </w:rPr>
-              <w:t>11 400,30</w:t>
+              <w:t>11 387,15</w:t>
             </w:r>
           </w:p>
         </w:tc>
@@ -13269,7 +13908,7 @@
               <w:rPr>
                 <w:sz w:val="17"/>
               </w:rPr>
-              <w:t>6 270,16</w:t>
+              <w:t>6 262,93</w:t>
             </w:r>
           </w:p>
         </w:tc>
@@ -13326,7 +13965,7 @@
               <w:rPr>
                 <w:sz w:val="17"/>
               </w:rPr>
-              <w:t>7 254,73</w:t>
+              <w:t>7 246,37</w:t>
             </w:r>
           </w:p>
         </w:tc>
@@ -13343,7 +13982,7 @@
               <w:rPr>
                 <w:sz w:val="17"/>
               </w:rPr>
-              <w:t>2 539,16</w:t>
+              <w:t>2 536,23</w:t>
             </w:r>
           </w:p>
         </w:tc>
@@ -13417,7 +14056,7 @@
               <w:rPr>
                 <w:sz w:val="17"/>
               </w:rPr>
-              <w:t>12 799,42</w:t>
+              <w:t>12 784,66</w:t>
             </w:r>
           </w:p>
         </w:tc>
@@ -13429,7 +14068,7 @@
         <w:jc w:val="both"/>
       </w:pPr>
       <w:r>
-        <w:t>El desarrollador concentra el mayor costo —S/ 6 270,16 sobre un total de S/ 12 799,42— porque el cronograma le asigna once de los veinte días, con siete consecutivos en construcción. El jefe de proyecto, en cambio, interviene un día por fase, con función de supervisión y control a lo largo de todo el ciclo de vida.</w:t>
+        <w:t>El desarrollador concentra el mayor costo —S/ 6 262,93 sobre un total de S/ 12 784,66— porque el cronograma le asigna once de los veinte días, con siete consecutivos en construcción. El jefe de proyecto, en cambio, interviene un día por fase, con función de supervisión y control a lo largo de todo el ciclo de vida.</w:t>
       </w:r>
     </w:p>
     <w:p>
@@ -13479,7 +14118,6 @@
                 <w:color w:val="E30613"/>
                 <w:sz w:val="68"/>
               </w:rPr>
-              <w:lastRenderedPageBreak/>
               <w:t>10</w:t>
             </w:r>
           </w:p>
@@ -13538,7 +14176,7 @@
         <w:jc w:val="both"/>
       </w:pPr>
       <w:r>
-        <w:t>El modelo COCOMO II estima el desarrollo en S/ 20 727,81, mientras que el costo real de la planilla, según el cronograma de veinte días, asciende a S/ 12 799,42. La diferencia de S/ 7 928,39 constituye el margen disponible para utilidad y gastos operativos, y confirma que la propuesta económica es técnicamente sostenible: se cobra por encima del costo de planilla sin superar la referencia del modelo.</w:t>
+        <w:t>El modelo COCOMO II estima el desarrollo en S/ 20 703,90, mientras que el costo real de la planilla, según el cronograma de veinte días, asciende a S/ 12 784,66. La diferencia de S/ 7 919,24 constituye el margen disponible para utilidad y gastos operativos, y confirma que la propuesta económica es técnicamente sostenible: se cobra por encima del costo de planilla sin superar la referencia del modelo.</w:t>
       </w:r>
     </w:p>
     <w:p>
@@ -13560,10 +14198,8 @@
       </w:r>
     </w:p>
     <w:sectPr>
-      <w:headerReference w:type="default" r:id="rId8"/>
-      <w:footerReference w:type="default" r:id="rId9"/>
-      <w:headerReference w:type="first" r:id="rId12"/>
-      <w:footerReference w:type="first" r:id="rId13"/>
+      <w:headerReference w:type="default" r:id="rId14"/>
+      <w:footerReference w:type="default" r:id="rId15"/>
       <w:pgSz w:w="11906" w:h="16838"/>
       <w:pgMar w:top="1361" w:right="1417" w:bottom="1134" w:left="1417" w:header="680" w:footer="624" w:gutter="0"/>
       <w:cols w:space="720"/>
@@ -13603,6 +14239,36 @@
   <w:p>
     <w:pPr>
       <w:pStyle w:val="Piedepgina"/>
+    </w:pPr>
+  </w:p>
+</w:ftr>
+</file>
+
+<file path=word/footer2.xml><?xml version="1.0" encoding="utf-8"?>
+<w:ftr xmlns:wpc="http://schemas.microsoft.com/office/word/2010/wordprocessingCanvas" xmlns:cx="http://schemas.microsoft.com/office/drawing/2014/chartex" xmlns:cx1="http://schemas.microsoft.com/office/drawing/2015/9/8/chartex" xmlns:cx2="http://schemas.microsoft.com/office/drawing/2015/10/21/chartex" xmlns:cx3="http://schemas.microsoft.com/office/drawing/2016/5/9/chartex" xmlns:cx4="http://schemas.microsoft.com/office/drawing/2016/5/10/chartex" xmlns:cx5="http://schemas.microsoft.com/office/drawing/2016/5/11/chartex" xmlns:cx6="http://schemas.microsoft.com/office/drawing/2016/5/12/chartex" xmlns:cx7="http://schemas.microsoft.com/office/drawing/2016/5/13/chartex" xmlns:cx8="http://schemas.microsoft.com/office/drawing/2016/5/14/chartex" xmlns:mc="http://schemas.openxmlformats.org/markup-compatibility/2006" xmlns:aink="http://schemas.microsoft.com/office/drawing/2016/ink" xmlns:am3d="http://schemas.microsoft.com/office/drawing/2017/model3d" xmlns:o="urn:schemas-microsoft-com:office:office" xmlns:oel="http://schemas.microsoft.com/office/2019/extlst" xmlns:r="http://schemas.openxmlformats.org/officeDocument/2006/relationships" xmlns:m="http://schemas.openxmlformats.org/officeDocument/2006/math" xmlns:v="urn:schemas-microsoft-com:vml" xmlns:wp14="http://schemas.microsoft.com/office/word/2010/wordprocessingDrawing" xmlns:wp="http://schemas.openxmlformats.org/drawingml/2006/wordprocessingDrawing" xmlns:w10="urn:schemas-microsoft-com:office:word" xmlns:w="http://schemas.openxmlformats.org/wordprocessingml/2006/main" xmlns:w14="http://schemas.microsoft.com/office/word/2010/wordml" xmlns:w15="http://schemas.microsoft.com/office/word/2012/wordml" xmlns:w16cex="http://schemas.microsoft.com/office/word/2018/wordml/cex" xmlns:w16cid="http://schemas.microsoft.com/office/word/2016/wordml/cid" xmlns:w16="http://schemas.microsoft.com/office/word/2018/wordml" xmlns:w16du="http://schemas.microsoft.com/office/word/2023/wordml/word16du" xmlns:w16sdtdh="http://schemas.microsoft.com/office/word/2020/wordml/sdtdatahash" xmlns:w16sdtfl="http://schemas.microsoft.com/office/word/2024/wordml/sdtformatlock" xmlns:w16se="http://schemas.microsoft.com/office/word/2015/wordml/symex" xmlns:wpg="http://schemas.microsoft.com/office/word/2010/wordprocessingGroup" xmlns:wpi="http://schemas.microsoft.com/office/word/2010/wordprocessingInk" xmlns:wne="http://schemas.microsoft.com/office/word/2006/wordml" xmlns:wps="http://schemas.microsoft.com/office/word/2010/wordprocessingShape" mc:Ignorable="w14 w15 w16se w16cid w16 w16cex w16sdtdh w16sdtfl w16du wp14">
+  <w:p>
+    <w:pPr>
+      <w:pStyle w:val="Piedepgina"/>
+    </w:pPr>
+  </w:p>
+</w:ftr>
+</file>
+
+<file path=word/footer3.xml><?xml version="1.0" encoding="utf-8"?>
+<w:ftr xmlns:wpc="http://schemas.microsoft.com/office/word/2010/wordprocessingCanvas" xmlns:cx="http://schemas.microsoft.com/office/drawing/2014/chartex" xmlns:cx1="http://schemas.microsoft.com/office/drawing/2015/9/8/chartex" xmlns:cx2="http://schemas.microsoft.com/office/drawing/2015/10/21/chartex" xmlns:cx3="http://schemas.microsoft.com/office/drawing/2016/5/9/chartex" xmlns:cx4="http://schemas.microsoft.com/office/drawing/2016/5/10/chartex" xmlns:cx5="http://schemas.microsoft.com/office/drawing/2016/5/11/chartex" xmlns:cx6="http://schemas.microsoft.com/office/drawing/2016/5/12/chartex" xmlns:cx7="http://schemas.microsoft.com/office/drawing/2016/5/13/chartex" xmlns:cx8="http://schemas.microsoft.com/office/drawing/2016/5/14/chartex" xmlns:mc="http://schemas.openxmlformats.org/markup-compatibility/2006" xmlns:aink="http://schemas.microsoft.com/office/drawing/2016/ink" xmlns:am3d="http://schemas.microsoft.com/office/drawing/2017/model3d" xmlns:o="urn:schemas-microsoft-com:office:office" xmlns:oel="http://schemas.microsoft.com/office/2019/extlst" xmlns:r="http://schemas.openxmlformats.org/officeDocument/2006/relationships" xmlns:m="http://schemas.openxmlformats.org/officeDocument/2006/math" xmlns:v="urn:schemas-microsoft-com:vml" xmlns:wp14="http://schemas.microsoft.com/office/word/2010/wordprocessingDrawing" xmlns:wp="http://schemas.openxmlformats.org/drawingml/2006/wordprocessingDrawing" xmlns:w10="urn:schemas-microsoft-com:office:word" xmlns:w="http://schemas.openxmlformats.org/wordprocessingml/2006/main" xmlns:w14="http://schemas.microsoft.com/office/word/2010/wordml" xmlns:w15="http://schemas.microsoft.com/office/word/2012/wordml" xmlns:w16cex="http://schemas.microsoft.com/office/word/2018/wordml/cex" xmlns:w16cid="http://schemas.microsoft.com/office/word/2016/wordml/cid" xmlns:w16="http://schemas.microsoft.com/office/word/2018/wordml" xmlns:w16du="http://schemas.microsoft.com/office/word/2023/wordml/word16du" xmlns:w16sdtdh="http://schemas.microsoft.com/office/word/2020/wordml/sdtdatahash" xmlns:w16sdtfl="http://schemas.microsoft.com/office/word/2024/wordml/sdtformatlock" xmlns:w16se="http://schemas.microsoft.com/office/word/2015/wordml/symex" xmlns:wpg="http://schemas.microsoft.com/office/word/2010/wordprocessingGroup" xmlns:wpi="http://schemas.microsoft.com/office/word/2010/wordprocessingInk" xmlns:wne="http://schemas.microsoft.com/office/word/2006/wordml" xmlns:wps="http://schemas.microsoft.com/office/word/2010/wordprocessingShape" mc:Ignorable="w14 w15 w16se w16cid w16 w16cex w16sdtdh w16sdtfl w16du wp14">
+  <w:p>
+    <w:pPr>
+      <w:pStyle w:val="Piedepgina"/>
+    </w:pPr>
+  </w:p>
+</w:ftr>
+</file>
+
+<file path=word/footer4.xml><?xml version="1.0" encoding="utf-8"?>
+<w:ftr xmlns:wpc="http://schemas.microsoft.com/office/word/2010/wordprocessingCanvas" xmlns:cx="http://schemas.microsoft.com/office/drawing/2014/chartex" xmlns:cx1="http://schemas.microsoft.com/office/drawing/2015/9/8/chartex" xmlns:cx2="http://schemas.microsoft.com/office/drawing/2015/10/21/chartex" xmlns:cx3="http://schemas.microsoft.com/office/drawing/2016/5/9/chartex" xmlns:cx4="http://schemas.microsoft.com/office/drawing/2016/5/10/chartex" xmlns:cx5="http://schemas.microsoft.com/office/drawing/2016/5/11/chartex" xmlns:cx6="http://schemas.microsoft.com/office/drawing/2016/5/12/chartex" xmlns:cx7="http://schemas.microsoft.com/office/drawing/2016/5/13/chartex" xmlns:cx8="http://schemas.microsoft.com/office/drawing/2016/5/14/chartex" xmlns:mc="http://schemas.openxmlformats.org/markup-compatibility/2006" xmlns:aink="http://schemas.microsoft.com/office/drawing/2016/ink" xmlns:am3d="http://schemas.microsoft.com/office/drawing/2017/model3d" xmlns:o="urn:schemas-microsoft-com:office:office" xmlns:oel="http://schemas.microsoft.com/office/2019/extlst" xmlns:r="http://schemas.openxmlformats.org/officeDocument/2006/relationships" xmlns:m="http://schemas.openxmlformats.org/officeDocument/2006/math" xmlns:v="urn:schemas-microsoft-com:vml" xmlns:wp14="http://schemas.microsoft.com/office/word/2010/wordprocessingDrawing" xmlns:wp="http://schemas.openxmlformats.org/drawingml/2006/wordprocessingDrawing" xmlns:w10="urn:schemas-microsoft-com:office:word" xmlns:w="http://schemas.openxmlformats.org/wordprocessingml/2006/main" xmlns:w14="http://schemas.microsoft.com/office/word/2010/wordml" xmlns:w15="http://schemas.microsoft.com/office/word/2012/wordml" xmlns:w16cex="http://schemas.microsoft.com/office/word/2018/wordml/cex" xmlns:w16cid="http://schemas.microsoft.com/office/word/2016/wordml/cid" xmlns:w16="http://schemas.microsoft.com/office/word/2018/wordml" xmlns:w16du="http://schemas.microsoft.com/office/word/2023/wordml/word16du" xmlns:w16sdtdh="http://schemas.microsoft.com/office/word/2020/wordml/sdtdatahash" xmlns:w16sdtfl="http://schemas.microsoft.com/office/word/2024/wordml/sdtformatlock" xmlns:w16se="http://schemas.microsoft.com/office/word/2015/wordml/symex" xmlns:wpg="http://schemas.microsoft.com/office/word/2010/wordprocessingGroup" xmlns:wpi="http://schemas.microsoft.com/office/word/2010/wordprocessingInk" xmlns:wne="http://schemas.microsoft.com/office/word/2006/wordml" xmlns:wps="http://schemas.microsoft.com/office/word/2010/wordprocessingShape" mc:Ignorable="w14 w15 w16se w16cid w16 w16cex w16sdtdh w16sdtfl w16du wp14">
+  <w:p>
+    <w:pPr>
+      <w:pStyle w:val="Piedepgina"/>
       <w:pBdr>
         <w:top w:val="single" w:sz="3" w:space="6" w:color="E4E6EA"/>
       </w:pBdr>
@@ -13616,23 +14282,7 @@
         <w:color w:val="6B7280"/>
         <w:sz w:val="15"/>
       </w:rPr>
-      <w:t xml:space="preserve">Modelo COCOMO II </w:t>
-    </w:r>
-    <w:proofErr w:type="spellStart"/>
-    <w:r>
-      <w:rPr>
-        <w:color w:val="6B7280"/>
-        <w:sz w:val="15"/>
-      </w:rPr>
-      <w:t>adaptado</w:t>
-    </w:r>
-    <w:proofErr w:type="spellEnd"/>
-    <w:r>
-      <w:rPr>
-        <w:color w:val="6B7280"/>
-        <w:sz w:val="15"/>
-      </w:rPr>
-      <w:t xml:space="preserve"> — RUTAS MTC</w:t>
+      <w:t>Modelo COCOMO II adaptado — RUTAS MTC</w:t>
     </w:r>
     <w:r>
       <w:tab/>
@@ -13662,16 +14312,6 @@
       </w:rPr>
       <w:fldChar w:fldCharType="end"/>
     </w:r>
-  </w:p>
-</w:ftr>
-</file>
-
-<file path=word/footer2.xml><?xml version="1.0" encoding="utf-8"?>
-<w:ftr xmlns:m="http://schemas.openxmlformats.org/officeDocument/2006/math" xmlns:mc="http://schemas.openxmlformats.org/markup-compatibility/2006" xmlns:mo="http://schemas.microsoft.com/office/mac/office/2008/main" xmlns:mv="urn:schemas-microsoft-com:mac:vml" xmlns:o="urn:schemas-microsoft-com:office:office" xmlns:r="http://schemas.openxmlformats.org/officeDocument/2006/relationships" xmlns:v="urn:schemas-microsoft-com:vml" xmlns:w10="urn:schemas-microsoft-com:office:word" xmlns:w14="http://schemas.microsoft.com/office/word/2010/wordml" xmlns:w="http://schemas.openxmlformats.org/wordprocessingml/2006/main" xmlns:wne="http://schemas.microsoft.com/office/word/2006/wordml" xmlns:wp14="http://schemas.microsoft.com/office/word/2010/wordprocessingDrawing" xmlns:wp="http://schemas.openxmlformats.org/drawingml/2006/wordprocessingDrawing" xmlns:wpc="http://schemas.microsoft.com/office/word/2010/wordprocessingCanvas" xmlns:wpg="http://schemas.microsoft.com/office/word/2010/wordprocessingGroup" xmlns:wpi="http://schemas.microsoft.com/office/word/2010/wordprocessingInk" xmlns:wps="http://schemas.microsoft.com/office/word/2010/wordprocessingShape" mc:Ignorable="w14 wp14">
-  <w:p>
-    <w:pPr>
-      <w:pStyle w:val="Footer"/>
-    </w:pPr>
   </w:p>
 </w:ftr>
 </file>
@@ -13706,6 +14346,36 @@
   <w:p>
     <w:pPr>
       <w:pStyle w:val="Encabezado"/>
+    </w:pPr>
+  </w:p>
+</w:hdr>
+</file>
+
+<file path=word/header2.xml><?xml version="1.0" encoding="utf-8"?>
+<w:hdr xmlns:wpc="http://schemas.microsoft.com/office/word/2010/wordprocessingCanvas" xmlns:cx="http://schemas.microsoft.com/office/drawing/2014/chartex" xmlns:cx1="http://schemas.microsoft.com/office/drawing/2015/9/8/chartex" xmlns:cx2="http://schemas.microsoft.com/office/drawing/2015/10/21/chartex" xmlns:cx3="http://schemas.microsoft.com/office/drawing/2016/5/9/chartex" xmlns:cx4="http://schemas.microsoft.com/office/drawing/2016/5/10/chartex" xmlns:cx5="http://schemas.microsoft.com/office/drawing/2016/5/11/chartex" xmlns:cx6="http://schemas.microsoft.com/office/drawing/2016/5/12/chartex" xmlns:cx7="http://schemas.microsoft.com/office/drawing/2016/5/13/chartex" xmlns:cx8="http://schemas.microsoft.com/office/drawing/2016/5/14/chartex" xmlns:mc="http://schemas.openxmlformats.org/markup-compatibility/2006" xmlns:aink="http://schemas.microsoft.com/office/drawing/2016/ink" xmlns:am3d="http://schemas.microsoft.com/office/drawing/2017/model3d" xmlns:o="urn:schemas-microsoft-com:office:office" xmlns:oel="http://schemas.microsoft.com/office/2019/extlst" xmlns:r="http://schemas.openxmlformats.org/officeDocument/2006/relationships" xmlns:m="http://schemas.openxmlformats.org/officeDocument/2006/math" xmlns:v="urn:schemas-microsoft-com:vml" xmlns:wp14="http://schemas.microsoft.com/office/word/2010/wordprocessingDrawing" xmlns:wp="http://schemas.openxmlformats.org/drawingml/2006/wordprocessingDrawing" xmlns:w10="urn:schemas-microsoft-com:office:word" xmlns:w="http://schemas.openxmlformats.org/wordprocessingml/2006/main" xmlns:w14="http://schemas.microsoft.com/office/word/2010/wordml" xmlns:w15="http://schemas.microsoft.com/office/word/2012/wordml" xmlns:w16cex="http://schemas.microsoft.com/office/word/2018/wordml/cex" xmlns:w16cid="http://schemas.microsoft.com/office/word/2016/wordml/cid" xmlns:w16="http://schemas.microsoft.com/office/word/2018/wordml" xmlns:w16du="http://schemas.microsoft.com/office/word/2023/wordml/word16du" xmlns:w16sdtdh="http://schemas.microsoft.com/office/word/2020/wordml/sdtdatahash" xmlns:w16sdtfl="http://schemas.microsoft.com/office/word/2024/wordml/sdtformatlock" xmlns:w16se="http://schemas.microsoft.com/office/word/2015/wordml/symex" xmlns:wpg="http://schemas.microsoft.com/office/word/2010/wordprocessingGroup" xmlns:wpi="http://schemas.microsoft.com/office/word/2010/wordprocessingInk" xmlns:wne="http://schemas.microsoft.com/office/word/2006/wordml" xmlns:wps="http://schemas.microsoft.com/office/word/2010/wordprocessingShape" mc:Ignorable="w14 w15 w16se w16cid w16 w16cex w16sdtdh w16sdtfl w16du wp14">
+  <w:p>
+    <w:pPr>
+      <w:pStyle w:val="Encabezado"/>
+    </w:pPr>
+  </w:p>
+</w:hdr>
+</file>
+
+<file path=word/header3.xml><?xml version="1.0" encoding="utf-8"?>
+<w:hdr xmlns:wpc="http://schemas.microsoft.com/office/word/2010/wordprocessingCanvas" xmlns:cx="http://schemas.microsoft.com/office/drawing/2014/chartex" xmlns:cx1="http://schemas.microsoft.com/office/drawing/2015/9/8/chartex" xmlns:cx2="http://schemas.microsoft.com/office/drawing/2015/10/21/chartex" xmlns:cx3="http://schemas.microsoft.com/office/drawing/2016/5/9/chartex" xmlns:cx4="http://schemas.microsoft.com/office/drawing/2016/5/10/chartex" xmlns:cx5="http://schemas.microsoft.com/office/drawing/2016/5/11/chartex" xmlns:cx6="http://schemas.microsoft.com/office/drawing/2016/5/12/chartex" xmlns:cx7="http://schemas.microsoft.com/office/drawing/2016/5/13/chartex" xmlns:cx8="http://schemas.microsoft.com/office/drawing/2016/5/14/chartex" xmlns:mc="http://schemas.openxmlformats.org/markup-compatibility/2006" xmlns:aink="http://schemas.microsoft.com/office/drawing/2016/ink" xmlns:am3d="http://schemas.microsoft.com/office/drawing/2017/model3d" xmlns:o="urn:schemas-microsoft-com:office:office" xmlns:oel="http://schemas.microsoft.com/office/2019/extlst" xmlns:r="http://schemas.openxmlformats.org/officeDocument/2006/relationships" xmlns:m="http://schemas.openxmlformats.org/officeDocument/2006/math" xmlns:v="urn:schemas-microsoft-com:vml" xmlns:wp14="http://schemas.microsoft.com/office/word/2010/wordprocessingDrawing" xmlns:wp="http://schemas.openxmlformats.org/drawingml/2006/wordprocessingDrawing" xmlns:w10="urn:schemas-microsoft-com:office:word" xmlns:w="http://schemas.openxmlformats.org/wordprocessingml/2006/main" xmlns:w14="http://schemas.microsoft.com/office/word/2010/wordml" xmlns:w15="http://schemas.microsoft.com/office/word/2012/wordml" xmlns:w16cex="http://schemas.microsoft.com/office/word/2018/wordml/cex" xmlns:w16cid="http://schemas.microsoft.com/office/word/2016/wordml/cid" xmlns:w16="http://schemas.microsoft.com/office/word/2018/wordml" xmlns:w16du="http://schemas.microsoft.com/office/word/2023/wordml/word16du" xmlns:w16sdtdh="http://schemas.microsoft.com/office/word/2020/wordml/sdtdatahash" xmlns:w16sdtfl="http://schemas.microsoft.com/office/word/2024/wordml/sdtformatlock" xmlns:w16se="http://schemas.microsoft.com/office/word/2015/wordml/symex" xmlns:wpg="http://schemas.microsoft.com/office/word/2010/wordprocessingGroup" xmlns:wpi="http://schemas.microsoft.com/office/word/2010/wordprocessingInk" xmlns:wne="http://schemas.microsoft.com/office/word/2006/wordml" xmlns:wps="http://schemas.microsoft.com/office/word/2010/wordprocessingShape" mc:Ignorable="w14 w15 w16se w16cid w16 w16cex w16sdtdh w16sdtfl w16du wp14">
+  <w:p>
+    <w:pPr>
+      <w:pStyle w:val="Encabezado"/>
+    </w:pPr>
+  </w:p>
+</w:hdr>
+</file>
+
+<file path=word/header4.xml><?xml version="1.0" encoding="utf-8"?>
+<w:hdr xmlns:wpc="http://schemas.microsoft.com/office/word/2010/wordprocessingCanvas" xmlns:cx="http://schemas.microsoft.com/office/drawing/2014/chartex" xmlns:cx1="http://schemas.microsoft.com/office/drawing/2015/9/8/chartex" xmlns:cx2="http://schemas.microsoft.com/office/drawing/2015/10/21/chartex" xmlns:cx3="http://schemas.microsoft.com/office/drawing/2016/5/9/chartex" xmlns:cx4="http://schemas.microsoft.com/office/drawing/2016/5/10/chartex" xmlns:cx5="http://schemas.microsoft.com/office/drawing/2016/5/11/chartex" xmlns:cx6="http://schemas.microsoft.com/office/drawing/2016/5/12/chartex" xmlns:cx7="http://schemas.microsoft.com/office/drawing/2016/5/13/chartex" xmlns:cx8="http://schemas.microsoft.com/office/drawing/2016/5/14/chartex" xmlns:mc="http://schemas.openxmlformats.org/markup-compatibility/2006" xmlns:aink="http://schemas.microsoft.com/office/drawing/2016/ink" xmlns:am3d="http://schemas.microsoft.com/office/drawing/2017/model3d" xmlns:o="urn:schemas-microsoft-com:office:office" xmlns:oel="http://schemas.microsoft.com/office/2019/extlst" xmlns:r="http://schemas.openxmlformats.org/officeDocument/2006/relationships" xmlns:m="http://schemas.openxmlformats.org/officeDocument/2006/math" xmlns:v="urn:schemas-microsoft-com:vml" xmlns:wp14="http://schemas.microsoft.com/office/word/2010/wordprocessingDrawing" xmlns:wp="http://schemas.openxmlformats.org/drawingml/2006/wordprocessingDrawing" xmlns:w10="urn:schemas-microsoft-com:office:word" xmlns:w="http://schemas.openxmlformats.org/wordprocessingml/2006/main" xmlns:w14="http://schemas.microsoft.com/office/word/2010/wordml" xmlns:w15="http://schemas.microsoft.com/office/word/2012/wordml" xmlns:w16cex="http://schemas.microsoft.com/office/word/2018/wordml/cex" xmlns:w16cid="http://schemas.microsoft.com/office/word/2016/wordml/cid" xmlns:w16="http://schemas.microsoft.com/office/word/2018/wordml" xmlns:w16du="http://schemas.microsoft.com/office/word/2023/wordml/word16du" xmlns:w16sdtdh="http://schemas.microsoft.com/office/word/2020/wordml/sdtdatahash" xmlns:w16sdtfl="http://schemas.microsoft.com/office/word/2024/wordml/sdtformatlock" xmlns:w16se="http://schemas.microsoft.com/office/word/2015/wordml/symex" xmlns:wpg="http://schemas.microsoft.com/office/word/2010/wordprocessingGroup" xmlns:wpi="http://schemas.microsoft.com/office/word/2010/wordprocessingInk" xmlns:wne="http://schemas.microsoft.com/office/word/2006/wordml" xmlns:wps="http://schemas.microsoft.com/office/word/2010/wordprocessingShape" mc:Ignorable="w14 w15 w16se w16cid w16 w16cex w16sdtdh w16sdtfl w16du wp14">
+  <w:p>
+    <w:pPr>
+      <w:pStyle w:val="Encabezado"/>
       <w:pBdr>
         <w:bottom w:val="single" w:sz="3" w:space="6" w:color="E4E6EA"/>
       </w:pBdr>
@@ -13733,16 +14403,6 @@
       </w:rPr>
       <w:t>RT-2026-001 · COCOMO II</w:t>
     </w:r>
-  </w:p>
-</w:hdr>
-</file>
-
-<file path=word/header2.xml><?xml version="1.0" encoding="utf-8"?>
-<w:hdr xmlns:m="http://schemas.openxmlformats.org/officeDocument/2006/math" xmlns:mc="http://schemas.openxmlformats.org/markup-compatibility/2006" xmlns:mo="http://schemas.microsoft.com/office/mac/office/2008/main" xmlns:mv="urn:schemas-microsoft-com:mac:vml" xmlns:o="urn:schemas-microsoft-com:office:office" xmlns:r="http://schemas.openxmlformats.org/officeDocument/2006/relationships" xmlns:v="urn:schemas-microsoft-com:vml" xmlns:w10="urn:schemas-microsoft-com:office:word" xmlns:w14="http://schemas.microsoft.com/office/word/2010/wordml" xmlns:w="http://schemas.openxmlformats.org/wordprocessingml/2006/main" xmlns:wne="http://schemas.microsoft.com/office/word/2006/wordml" xmlns:wp14="http://schemas.microsoft.com/office/word/2010/wordprocessingDrawing" xmlns:wp="http://schemas.openxmlformats.org/drawingml/2006/wordprocessingDrawing" xmlns:wpc="http://schemas.microsoft.com/office/word/2010/wordprocessingCanvas" xmlns:wpg="http://schemas.microsoft.com/office/word/2010/wordprocessingGroup" xmlns:wpi="http://schemas.microsoft.com/office/word/2010/wordprocessingInk" xmlns:wps="http://schemas.microsoft.com/office/word/2010/wordprocessingShape" mc:Ignorable="w14 wp14">
-  <w:p>
-    <w:pPr>
-      <w:pStyle w:val="Header"/>
-    </w:pPr>
   </w:p>
 </w:hdr>
 </file>

</xml_diff>